<commit_message>
Add timeline and Ghana donor shortlist to the Laurence one-pager.
Page 2 now carries the stage timeline and five sourced funders for a university-hosted climate hub.

Co-authored-by: gideonblaauw-creator <gideonblaauw-creator@users.noreply.github.com>
</commit_message>
<xml_diff>
--- a/archive/rein-hubs/2026-10-20-laurence-ghana-onepager.docx
+++ b/archive/rein-hubs/2026-10-20-laurence-ghana-onepager.docx
@@ -1518,6 +1518,1571 @@
         <w:t>TO CONFIRM</w:t>
       </w:r>
     </w:p>
+    <w:p>
+      <w:r>
+        <w:br w:type="page"/>
+      </w:r>
+    </w:p>
+    <w:p>
+      <w:pPr>
+        <w:keepNext/>
+        <w:spacing w:before="0" w:after="20" w:line="280" w:lineRule="exact"/>
+      </w:pPr>
+      <w:r>
+        <w:rPr>
+          <w:rFonts w:ascii="Arial" w:hAnsi="Arial" w:cs="Arial" w:eastAsia="Arial"/>
+          <w:b/>
+          <w:i w:val="0"/>
+          <w:color w:val="335D4F"/>
+          <w:sz w:val="24"/>
+        </w:rPr>
+        <w:t>4. Timeline</w:t>
+      </w:r>
+    </w:p>
+    <w:p>
+      <w:pPr>
+        <w:spacing w:before="0" w:after="40" w:line="220" w:lineRule="exact"/>
+      </w:pPr>
+      <w:r>
+        <w:rPr>
+          <w:rFonts w:ascii="Georgia" w:hAnsi="Georgia" w:cs="Georgia" w:eastAsia="Georgia"/>
+          <w:b w:val="0"/>
+          <w:i w:val="0"/>
+          <w:color w:val="222A27"/>
+          <w:sz w:val="18"/>
+        </w:rPr>
+        <w:t>Stages run back to back: Ideation 4 weeks, Incubation 10 weeks, Acceleration 12 weeks, Growth 12 weeks (38 weeks). Only the Pav meeting date and the UNGA82 calendar are fixed below. Every other date is TO CONFIRM.</w:t>
+      </w:r>
+    </w:p>
+    <w:tbl>
+      <w:tblPr>
+        <w:tblW w:type="dxa" w:w="10656"/>
+        <w:tblLayout w:type="fixed"/>
+        <w:tblLook w:firstColumn="1" w:firstRow="1" w:lastColumn="0" w:lastRow="0" w:noHBand="0" w:noVBand="1" w:val="04A0"/>
+        <w:tblBorders>
+          <w:top w:val="single" w:sz="4" w:space="0" w:color="335D4F"/>
+          <w:left w:val="single" w:sz="4" w:space="0" w:color="335D4F"/>
+          <w:bottom w:val="single" w:sz="4" w:space="0" w:color="335D4F"/>
+          <w:right w:val="single" w:sz="4" w:space="0" w:color="335D4F"/>
+          <w:insideH w:val="single" w:sz="4" w:space="0" w:color="335D4F"/>
+          <w:insideV w:val="single" w:sz="4" w:space="0" w:color="335D4F"/>
+        </w:tblBorders>
+      </w:tblPr>
+      <w:tblGrid>
+        <w:gridCol w:w="3542"/>
+        <w:gridCol w:w="3556"/>
+        <w:gridCol w:w="3556"/>
+      </w:tblGrid>
+      <w:tr>
+        <w:trPr>
+          <w:cantSplit/>
+        </w:trPr>
+        <w:tc>
+          <w:tcPr>
+            <w:tcW w:type="dxa" w:w="3542"/>
+            <w:shd w:val="clear" w:color="auto" w:fill="335D4F"/>
+            <w:vAlign w:val="center"/>
+            <w:tcMar>
+              <w:top w:w="26" w:type="dxa"/>
+              <w:left w:w="40" w:type="dxa"/>
+              <w:bottom w:w="26" w:type="dxa"/>
+              <w:right w:w="40" w:type="dxa"/>
+            </w:tcMar>
+          </w:tcPr>
+          <w:p>
+            <w:pPr>
+              <w:spacing w:before="0" w:after="0" w:line="190" w:lineRule="exact"/>
+              <w:jc w:val="center"/>
+            </w:pPr>
+            <w:r/>
+            <w:r>
+              <w:rPr>
+                <w:rFonts w:ascii="Arial" w:hAnsi="Arial" w:cs="Arial" w:eastAsia="Arial"/>
+                <w:b/>
+                <w:i w:val="0"/>
+                <w:color w:val="FFFFFF"/>
+                <w:sz w:val="16"/>
+              </w:rPr>
+              <w:t>21 Oct 2026</w:t>
+            </w:r>
+            <w:r>
+              <w:br/>
+            </w:r>
+            <w:r>
+              <w:rPr>
+                <w:rFonts w:ascii="Arial" w:hAnsi="Arial" w:cs="Arial" w:eastAsia="Arial"/>
+                <w:b w:val="0"/>
+                <w:i w:val="0"/>
+                <w:color w:val="FFFFFF"/>
+                <w:sz w:val="16"/>
+              </w:rPr>
+              <w:t>Meeting with Pav</w:t>
+            </w:r>
+          </w:p>
+        </w:tc>
+        <w:tc>
+          <w:tcPr>
+            <w:tcW w:type="dxa" w:w="3556"/>
+            <w:shd w:val="clear" w:color="auto" w:fill="FF6633"/>
+            <w:vAlign w:val="center"/>
+            <w:tcMar>
+              <w:top w:w="26" w:type="dxa"/>
+              <w:left w:w="40" w:type="dxa"/>
+              <w:bottom w:w="26" w:type="dxa"/>
+              <w:right w:w="40" w:type="dxa"/>
+            </w:tcMar>
+          </w:tcPr>
+          <w:p>
+            <w:pPr>
+              <w:spacing w:before="0" w:after="0" w:line="190" w:lineRule="exact"/>
+              <w:jc w:val="center"/>
+            </w:pPr>
+            <w:r/>
+            <w:r>
+              <w:rPr>
+                <w:rFonts w:ascii="Arial" w:hAnsi="Arial" w:cs="Arial" w:eastAsia="Arial"/>
+                <w:b/>
+                <w:i w:val="0"/>
+                <w:color w:val="FFFFFF"/>
+                <w:sz w:val="16"/>
+              </w:rPr>
+              <w:t>1 Dec 2026</w:t>
+            </w:r>
+            <w:r>
+              <w:br/>
+            </w:r>
+            <w:r>
+              <w:rPr>
+                <w:rFonts w:ascii="Arial" w:hAnsi="Arial" w:cs="Arial" w:eastAsia="Arial"/>
+                <w:b w:val="0"/>
+                <w:i w:val="0"/>
+                <w:color w:val="FFFFFF"/>
+                <w:sz w:val="16"/>
+              </w:rPr>
+              <w:t>Agreement and Year 1 funding</w:t>
+            </w:r>
+            <w:r>
+              <w:br/>
+            </w:r>
+            <w:r>
+              <w:rPr>
+                <w:rFonts w:ascii="Arial" w:hAnsi="Arial" w:cs="Arial" w:eastAsia="Arial"/>
+                <w:b/>
+                <w:i w:val="0"/>
+                <w:color w:val="FFFFFF"/>
+                <w:sz w:val="16"/>
+              </w:rPr>
+              <w:t>TO CONFIRM</w:t>
+            </w:r>
+          </w:p>
+        </w:tc>
+        <w:tc>
+          <w:tcPr>
+            <w:tcW w:type="dxa" w:w="3556"/>
+            <w:shd w:val="clear" w:color="auto" w:fill="FF6633"/>
+            <w:vAlign w:val="center"/>
+            <w:tcMar>
+              <w:top w:w="26" w:type="dxa"/>
+              <w:left w:w="40" w:type="dxa"/>
+              <w:bottom w:w="26" w:type="dxa"/>
+              <w:right w:w="40" w:type="dxa"/>
+            </w:tcMar>
+          </w:tcPr>
+          <w:p>
+            <w:pPr>
+              <w:spacing w:before="0" w:after="0" w:line="190" w:lineRule="exact"/>
+              <w:jc w:val="center"/>
+            </w:pPr>
+            <w:r/>
+            <w:r>
+              <w:rPr>
+                <w:rFonts w:ascii="Arial" w:hAnsi="Arial" w:cs="Arial" w:eastAsia="Arial"/>
+                <w:b/>
+                <w:i w:val="0"/>
+                <w:color w:val="FFFFFF"/>
+                <w:sz w:val="16"/>
+              </w:rPr>
+              <w:t>Q1 2027</w:t>
+            </w:r>
+            <w:r>
+              <w:br/>
+            </w:r>
+            <w:r>
+              <w:rPr>
+                <w:rFonts w:ascii="Arial" w:hAnsi="Arial" w:cs="Arial" w:eastAsia="Arial"/>
+                <w:b w:val="0"/>
+                <w:i w:val="0"/>
+                <w:color w:val="FFFFFF"/>
+                <w:sz w:val="16"/>
+              </w:rPr>
+              <w:t>Year 1 launch</w:t>
+            </w:r>
+            <w:r>
+              <w:br/>
+            </w:r>
+            <w:r>
+              <w:rPr>
+                <w:rFonts w:ascii="Arial" w:hAnsi="Arial" w:cs="Arial" w:eastAsia="Arial"/>
+                <w:b/>
+                <w:i w:val="0"/>
+                <w:color w:val="FFFFFF"/>
+                <w:sz w:val="16"/>
+              </w:rPr>
+              <w:t>ASSUMPTION / TO CONFIRM</w:t>
+            </w:r>
+          </w:p>
+        </w:tc>
+      </w:tr>
+    </w:tbl>
+    <w:tbl>
+      <w:tblPr>
+        <w:tblW w:type="dxa" w:w="10656"/>
+        <w:tblLayout w:type="fixed"/>
+        <w:tblLook w:firstColumn="1" w:firstRow="1" w:lastColumn="0" w:lastRow="0" w:noHBand="0" w:noVBand="1" w:val="04A0"/>
+        <w:tblBorders>
+          <w:top w:val="single" w:sz="4" w:space="0" w:color="FFFFFF"/>
+          <w:left w:val="single" w:sz="4" w:space="0" w:color="FFFFFF"/>
+          <w:bottom w:val="single" w:sz="4" w:space="0" w:color="FFFFFF"/>
+          <w:right w:val="single" w:sz="4" w:space="0" w:color="FFFFFF"/>
+          <w:insideH w:val="single" w:sz="4" w:space="0" w:color="FFFFFF"/>
+          <w:insideV w:val="single" w:sz="4" w:space="0" w:color="FFFFFF"/>
+        </w:tblBorders>
+      </w:tblPr>
+      <w:tblGrid>
+        <w:gridCol w:w="1121"/>
+        <w:gridCol w:w="2804"/>
+        <w:gridCol w:w="3365"/>
+        <w:gridCol w:w="3365"/>
+      </w:tblGrid>
+      <w:tr>
+        <w:trPr>
+          <w:cantSplit/>
+        </w:trPr>
+        <w:tc>
+          <w:tcPr>
+            <w:tcW w:type="dxa" w:w="1121"/>
+            <w:shd w:val="clear" w:color="auto" w:fill="1B4332"/>
+            <w:vAlign w:val="center"/>
+            <w:tcMar>
+              <w:top w:w="26" w:type="dxa"/>
+              <w:left w:w="40" w:type="dxa"/>
+              <w:bottom w:w="26" w:type="dxa"/>
+              <w:right w:w="40" w:type="dxa"/>
+            </w:tcMar>
+          </w:tcPr>
+          <w:p>
+            <w:pPr>
+              <w:spacing w:before="0" w:after="0" w:line="190" w:lineRule="exact"/>
+              <w:jc w:val="center"/>
+            </w:pPr>
+            <w:r/>
+            <w:r>
+              <w:rPr>
+                <w:rFonts w:ascii="Arial" w:hAnsi="Arial" w:cs="Arial" w:eastAsia="Arial"/>
+                <w:b/>
+                <w:i w:val="0"/>
+                <w:color w:val="FFFFFF"/>
+                <w:sz w:val="16"/>
+              </w:rPr>
+              <w:t>Ideation</w:t>
+            </w:r>
+            <w:r>
+              <w:br/>
+            </w:r>
+            <w:r>
+              <w:rPr>
+                <w:rFonts w:ascii="Arial" w:hAnsi="Arial" w:cs="Arial" w:eastAsia="Arial"/>
+                <w:b/>
+                <w:i w:val="0"/>
+                <w:color w:val="FFFFFF"/>
+                <w:sz w:val="16"/>
+              </w:rPr>
+              <w:t>4 weeks</w:t>
+            </w:r>
+          </w:p>
+        </w:tc>
+        <w:tc>
+          <w:tcPr>
+            <w:tcW w:type="dxa" w:w="2804"/>
+            <w:shd w:val="clear" w:color="auto" w:fill="335D4F"/>
+            <w:vAlign w:val="center"/>
+            <w:tcMar>
+              <w:top w:w="26" w:type="dxa"/>
+              <w:left w:w="40" w:type="dxa"/>
+              <w:bottom w:w="26" w:type="dxa"/>
+              <w:right w:w="40" w:type="dxa"/>
+            </w:tcMar>
+          </w:tcPr>
+          <w:p>
+            <w:pPr>
+              <w:spacing w:before="0" w:after="0" w:line="190" w:lineRule="exact"/>
+              <w:jc w:val="center"/>
+            </w:pPr>
+            <w:r/>
+            <w:r>
+              <w:rPr>
+                <w:rFonts w:ascii="Arial" w:hAnsi="Arial" w:cs="Arial" w:eastAsia="Arial"/>
+                <w:b/>
+                <w:i w:val="0"/>
+                <w:color w:val="FFFFFF"/>
+                <w:sz w:val="16"/>
+              </w:rPr>
+              <w:t>Incubation</w:t>
+            </w:r>
+            <w:r>
+              <w:br/>
+            </w:r>
+            <w:r>
+              <w:rPr>
+                <w:rFonts w:ascii="Arial" w:hAnsi="Arial" w:cs="Arial" w:eastAsia="Arial"/>
+                <w:b/>
+                <w:i w:val="0"/>
+                <w:color w:val="FFFFFF"/>
+                <w:sz w:val="16"/>
+              </w:rPr>
+              <w:t>10 weeks</w:t>
+            </w:r>
+          </w:p>
+        </w:tc>
+        <w:tc>
+          <w:tcPr>
+            <w:tcW w:type="dxa" w:w="3365"/>
+            <w:shd w:val="clear" w:color="auto" w:fill="3E6B58"/>
+            <w:vAlign w:val="center"/>
+            <w:tcMar>
+              <w:top w:w="26" w:type="dxa"/>
+              <w:left w:w="40" w:type="dxa"/>
+              <w:bottom w:w="26" w:type="dxa"/>
+              <w:right w:w="40" w:type="dxa"/>
+            </w:tcMar>
+          </w:tcPr>
+          <w:p>
+            <w:pPr>
+              <w:spacing w:before="0" w:after="0" w:line="190" w:lineRule="exact"/>
+              <w:jc w:val="center"/>
+            </w:pPr>
+            <w:r/>
+            <w:r>
+              <w:rPr>
+                <w:rFonts w:ascii="Arial" w:hAnsi="Arial" w:cs="Arial" w:eastAsia="Arial"/>
+                <w:b/>
+                <w:i w:val="0"/>
+                <w:color w:val="FFFFFF"/>
+                <w:sz w:val="16"/>
+              </w:rPr>
+              <w:t>Acceleration</w:t>
+            </w:r>
+            <w:r>
+              <w:br/>
+            </w:r>
+            <w:r>
+              <w:rPr>
+                <w:rFonts w:ascii="Arial" w:hAnsi="Arial" w:cs="Arial" w:eastAsia="Arial"/>
+                <w:b/>
+                <w:i w:val="0"/>
+                <w:color w:val="FFFFFF"/>
+                <w:sz w:val="16"/>
+              </w:rPr>
+              <w:t>12 weeks</w:t>
+            </w:r>
+          </w:p>
+        </w:tc>
+        <w:tc>
+          <w:tcPr>
+            <w:tcW w:type="dxa" w:w="3365"/>
+            <w:shd w:val="clear" w:color="auto" w:fill="FF6633"/>
+            <w:vAlign w:val="center"/>
+            <w:tcMar>
+              <w:top w:w="26" w:type="dxa"/>
+              <w:left w:w="40" w:type="dxa"/>
+              <w:bottom w:w="26" w:type="dxa"/>
+              <w:right w:w="40" w:type="dxa"/>
+            </w:tcMar>
+          </w:tcPr>
+          <w:p>
+            <w:pPr>
+              <w:spacing w:before="0" w:after="0" w:line="190" w:lineRule="exact"/>
+              <w:jc w:val="center"/>
+            </w:pPr>
+            <w:r/>
+            <w:r>
+              <w:rPr>
+                <w:rFonts w:ascii="Arial" w:hAnsi="Arial" w:cs="Arial" w:eastAsia="Arial"/>
+                <w:b/>
+                <w:i w:val="0"/>
+                <w:color w:val="FFFFFF"/>
+                <w:sz w:val="16"/>
+              </w:rPr>
+              <w:t>Growth</w:t>
+            </w:r>
+            <w:r>
+              <w:br/>
+            </w:r>
+            <w:r>
+              <w:rPr>
+                <w:rFonts w:ascii="Arial" w:hAnsi="Arial" w:cs="Arial" w:eastAsia="Arial"/>
+                <w:b/>
+                <w:i w:val="0"/>
+                <w:color w:val="FFFFFF"/>
+                <w:sz w:val="16"/>
+              </w:rPr>
+              <w:t>12 weeks</w:t>
+            </w:r>
+          </w:p>
+        </w:tc>
+      </w:tr>
+    </w:tbl>
+    <w:tbl>
+      <w:tblPr>
+        <w:tblW w:type="dxa" w:w="10656"/>
+        <w:tblLayout w:type="fixed"/>
+        <w:tblLook w:firstColumn="1" w:firstRow="1" w:lastColumn="0" w:lastRow="0" w:noHBand="0" w:noVBand="1" w:val="04A0"/>
+        <w:tblBorders>
+          <w:top w:val="single" w:sz="4" w:space="0" w:color="335D4F"/>
+          <w:left w:val="single" w:sz="4" w:space="0" w:color="335D4F"/>
+          <w:bottom w:val="single" w:sz="4" w:space="0" w:color="335D4F"/>
+          <w:right w:val="single" w:sz="4" w:space="0" w:color="335D4F"/>
+          <w:insideH w:val="single" w:sz="4" w:space="0" w:color="335D4F"/>
+          <w:insideV w:val="single" w:sz="4" w:space="0" w:color="335D4F"/>
+        </w:tblBorders>
+      </w:tblPr>
+      <w:tblGrid>
+        <w:gridCol w:w="3542"/>
+        <w:gridCol w:w="3556"/>
+        <w:gridCol w:w="3556"/>
+      </w:tblGrid>
+      <w:tr>
+        <w:trPr>
+          <w:cantSplit/>
+        </w:trPr>
+        <w:tc>
+          <w:tcPr>
+            <w:tcW w:type="dxa" w:w="3542"/>
+            <w:shd w:val="clear" w:color="auto" w:fill="335D4F"/>
+            <w:vAlign w:val="center"/>
+            <w:tcMar>
+              <w:top w:w="26" w:type="dxa"/>
+              <w:left w:w="40" w:type="dxa"/>
+              <w:bottom w:w="26" w:type="dxa"/>
+              <w:right w:w="40" w:type="dxa"/>
+            </w:tcMar>
+          </w:tcPr>
+          <w:p>
+            <w:pPr>
+              <w:spacing w:before="0" w:after="0" w:line="180" w:lineRule="exact"/>
+              <w:jc w:val="center"/>
+            </w:pPr>
+            <w:r/>
+            <w:r>
+              <w:rPr>
+                <w:rFonts w:ascii="Arial" w:hAnsi="Arial" w:cs="Arial" w:eastAsia="Arial"/>
+                <w:b/>
+                <w:i w:val="0"/>
+                <w:color w:val="FFFFFF"/>
+                <w:sz w:val="15"/>
+              </w:rPr>
+              <w:t>Sept 2027</w:t>
+            </w:r>
+            <w:r>
+              <w:br/>
+            </w:r>
+            <w:r>
+              <w:rPr>
+                <w:rFonts w:ascii="Arial" w:hAnsi="Arial" w:cs="Arial" w:eastAsia="Arial"/>
+                <w:b w:val="0"/>
+                <w:i w:val="0"/>
+                <w:color w:val="FFFFFF"/>
+                <w:sz w:val="15"/>
+              </w:rPr>
+              <w:t>UNGA82 and Climate Week NYC</w:t>
+            </w:r>
+            <w:r>
+              <w:br/>
+            </w:r>
+            <w:r>
+              <w:rPr>
+                <w:rFonts w:ascii="Arial" w:hAnsi="Arial" w:cs="Arial" w:eastAsia="Arial"/>
+                <w:b/>
+                <w:i w:val="0"/>
+                <w:color w:val="FFFFFF"/>
+                <w:sz w:val="15"/>
+              </w:rPr>
+              <w:t>Team slots TO CONFIRM</w:t>
+            </w:r>
+          </w:p>
+        </w:tc>
+        <w:tc>
+          <w:tcPr>
+            <w:tcW w:type="dxa" w:w="3556"/>
+            <w:shd w:val="clear" w:color="auto" w:fill="FF6633"/>
+            <w:vAlign w:val="center"/>
+            <w:tcMar>
+              <w:top w:w="26" w:type="dxa"/>
+              <w:left w:w="40" w:type="dxa"/>
+              <w:bottom w:w="26" w:type="dxa"/>
+              <w:right w:w="40" w:type="dxa"/>
+            </w:tcMar>
+          </w:tcPr>
+          <w:p>
+            <w:pPr>
+              <w:spacing w:before="0" w:after="0" w:line="190" w:lineRule="exact"/>
+              <w:jc w:val="center"/>
+            </w:pPr>
+            <w:r/>
+            <w:r>
+              <w:rPr>
+                <w:rFonts w:ascii="Arial" w:hAnsi="Arial" w:cs="Arial" w:eastAsia="Arial"/>
+                <w:b/>
+                <w:i w:val="0"/>
+                <w:color w:val="FFFFFF"/>
+                <w:sz w:val="16"/>
+              </w:rPr>
+              <w:t>2028</w:t>
+            </w:r>
+            <w:r>
+              <w:br/>
+            </w:r>
+            <w:r>
+              <w:rPr>
+                <w:rFonts w:ascii="Arial" w:hAnsi="Arial" w:cs="Arial" w:eastAsia="Arial"/>
+                <w:b w:val="0"/>
+                <w:i w:val="0"/>
+                <w:color w:val="FFFFFF"/>
+                <w:sz w:val="16"/>
+              </w:rPr>
+              <w:t>Year 2, US$75,000</w:t>
+            </w:r>
+            <w:r>
+              <w:br/>
+            </w:r>
+            <w:r>
+              <w:rPr>
+                <w:rFonts w:ascii="Arial" w:hAnsi="Arial" w:cs="Arial" w:eastAsia="Arial"/>
+                <w:b/>
+                <w:i w:val="0"/>
+                <w:color w:val="FFFFFF"/>
+                <w:sz w:val="16"/>
+              </w:rPr>
+              <w:t>TO CONFIRM</w:t>
+            </w:r>
+          </w:p>
+        </w:tc>
+        <w:tc>
+          <w:tcPr>
+            <w:tcW w:type="dxa" w:w="3556"/>
+            <w:shd w:val="clear" w:color="auto" w:fill="FF6633"/>
+            <w:vAlign w:val="center"/>
+            <w:tcMar>
+              <w:top w:w="26" w:type="dxa"/>
+              <w:left w:w="40" w:type="dxa"/>
+              <w:bottom w:w="26" w:type="dxa"/>
+              <w:right w:w="40" w:type="dxa"/>
+            </w:tcMar>
+          </w:tcPr>
+          <w:p>
+            <w:pPr>
+              <w:spacing w:before="0" w:after="0" w:line="190" w:lineRule="exact"/>
+              <w:jc w:val="center"/>
+            </w:pPr>
+            <w:r/>
+            <w:r>
+              <w:rPr>
+                <w:rFonts w:ascii="Arial" w:hAnsi="Arial" w:cs="Arial" w:eastAsia="Arial"/>
+                <w:b/>
+                <w:i w:val="0"/>
+                <w:color w:val="FFFFFF"/>
+                <w:sz w:val="16"/>
+              </w:rPr>
+              <w:t>2029</w:t>
+            </w:r>
+            <w:r>
+              <w:br/>
+            </w:r>
+            <w:r>
+              <w:rPr>
+                <w:rFonts w:ascii="Arial" w:hAnsi="Arial" w:cs="Arial" w:eastAsia="Arial"/>
+                <w:b w:val="0"/>
+                <w:i w:val="0"/>
+                <w:color w:val="FFFFFF"/>
+                <w:sz w:val="16"/>
+              </w:rPr>
+              <w:t>Year 3, US$50,000</w:t>
+            </w:r>
+            <w:r>
+              <w:br/>
+            </w:r>
+            <w:r>
+              <w:rPr>
+                <w:rFonts w:ascii="Arial" w:hAnsi="Arial" w:cs="Arial" w:eastAsia="Arial"/>
+                <w:b/>
+                <w:i w:val="0"/>
+                <w:color w:val="FFFFFF"/>
+                <w:sz w:val="16"/>
+              </w:rPr>
+              <w:t>TO CONFIRM</w:t>
+            </w:r>
+          </w:p>
+        </w:tc>
+      </w:tr>
+    </w:tbl>
+    <w:p>
+      <w:pPr>
+        <w:spacing w:before="40" w:after="20" w:line="210" w:lineRule="exact"/>
+      </w:pPr>
+      <w:r>
+        <w:rPr>
+          <w:rFonts w:ascii="Georgia" w:hAnsi="Georgia" w:cs="Georgia" w:eastAsia="Georgia"/>
+          <w:b w:val="0"/>
+          <w:i w:val="0"/>
+          <w:color w:val="222A27"/>
+          <w:sz w:val="17"/>
+        </w:rPr>
+        <w:t>UNGA82 opens 7 September 2027. The general debate opens 21 September 2027 (UN schedule). Climate Week NYC is the same month. Exact Climate Week dates are TO CONFIRM. The REIN plan is an SDG Media Zone slot for 2 incubation winners and 2 growth teams. That slot is TO CONFIRM. Stage weeks are not pinned to calendar dates until the launch is agreed.</w:t>
+      </w:r>
+    </w:p>
+    <w:p>
+      <w:pPr>
+        <w:keepNext/>
+        <w:spacing w:before="80" w:after="20" w:line="280" w:lineRule="exact"/>
+      </w:pPr>
+      <w:r>
+        <w:rPr>
+          <w:rFonts w:ascii="Arial" w:hAnsi="Arial" w:cs="Arial" w:eastAsia="Arial"/>
+          <w:b/>
+          <w:i w:val="0"/>
+          <w:color w:val="335D4F"/>
+          <w:sz w:val="24"/>
+        </w:rPr>
+        <w:t>5. Top 5 donors in Ghana</w:t>
+      </w:r>
+    </w:p>
+    <w:p>
+      <w:pPr>
+        <w:spacing w:before="0" w:after="40" w:line="210" w:lineRule="exact"/>
+      </w:pPr>
+      <w:r>
+        <w:rPr>
+          <w:rFonts w:ascii="Georgia" w:hAnsi="Georgia" w:cs="Georgia" w:eastAsia="Georgia"/>
+          <w:b w:val="0"/>
+          <w:i w:val="0"/>
+          <w:color w:val="222A27"/>
+          <w:sz w:val="17"/>
+        </w:rPr>
+        <w:t>Ranked for a university-hosted climate-startup hub that needs a multi-year grant of US$500,000 to US$1 million. Ticket sizes are copied from the public source. Anything not in that source is marked UNVERIFIED.</w:t>
+      </w:r>
+    </w:p>
+    <w:tbl>
+      <w:tblPr>
+        <w:tblW w:type="dxa" w:w="10656"/>
+        <w:tblLayout w:type="fixed"/>
+        <w:tblLook w:firstColumn="1" w:firstRow="1" w:lastColumn="0" w:lastRow="0" w:noHBand="0" w:noVBand="1" w:val="04A0"/>
+        <w:tblBorders>
+          <w:top w:val="single" w:sz="4" w:space="0" w:color="C5D5CE"/>
+          <w:left w:val="single" w:sz="4" w:space="0" w:color="C5D5CE"/>
+          <w:bottom w:val="single" w:sz="4" w:space="0" w:color="C5D5CE"/>
+          <w:right w:val="single" w:sz="4" w:space="0" w:color="C5D5CE"/>
+          <w:insideH w:val="single" w:sz="4" w:space="0" w:color="C5D5CE"/>
+          <w:insideV w:val="single" w:sz="4" w:space="0" w:color="C5D5CE"/>
+        </w:tblBorders>
+      </w:tblPr>
+      <w:tblGrid>
+        <w:gridCol w:w="1655"/>
+        <w:gridCol w:w="2232"/>
+        <w:gridCol w:w="2448"/>
+        <w:gridCol w:w="2448"/>
+        <w:gridCol w:w="1872"/>
+      </w:tblGrid>
+      <w:tr>
+        <w:trPr>
+          <w:cantSplit/>
+        </w:trPr>
+        <w:tc>
+          <w:tcPr>
+            <w:tcW w:type="dxa" w:w="1655"/>
+            <w:shd w:val="clear" w:color="auto" w:fill="335D4F"/>
+            <w:vAlign w:val="center"/>
+            <w:tcMar>
+              <w:top w:w="30" w:type="dxa"/>
+              <w:left w:w="70" w:type="dxa"/>
+              <w:bottom w:w="30" w:type="dxa"/>
+              <w:right w:w="70" w:type="dxa"/>
+            </w:tcMar>
+          </w:tcPr>
+          <w:p>
+            <w:pPr>
+              <w:spacing w:before="0" w:after="0" w:line="180" w:lineRule="exact"/>
+            </w:pPr>
+            <w:r/>
+            <w:r>
+              <w:rPr>
+                <w:rFonts w:ascii="Arial" w:hAnsi="Arial" w:cs="Arial" w:eastAsia="Arial"/>
+                <w:b/>
+                <w:i w:val="0"/>
+                <w:color w:val="FFFFFF"/>
+                <w:sz w:val="14"/>
+              </w:rPr>
+              <w:t>Donor</w:t>
+            </w:r>
+          </w:p>
+        </w:tc>
+        <w:tc>
+          <w:tcPr>
+            <w:tcW w:type="dxa" w:w="2232"/>
+            <w:shd w:val="clear" w:color="auto" w:fill="335D4F"/>
+            <w:vAlign w:val="center"/>
+            <w:tcMar>
+              <w:top w:w="30" w:type="dxa"/>
+              <w:left w:w="70" w:type="dxa"/>
+              <w:bottom w:w="30" w:type="dxa"/>
+              <w:right w:w="70" w:type="dxa"/>
+            </w:tcMar>
+          </w:tcPr>
+          <w:p>
+            <w:pPr>
+              <w:spacing w:before="0" w:after="0" w:line="180" w:lineRule="exact"/>
+            </w:pPr>
+            <w:r/>
+            <w:r>
+              <w:rPr>
+                <w:rFonts w:ascii="Arial" w:hAnsi="Arial" w:cs="Arial" w:eastAsia="Arial"/>
+                <w:b/>
+                <w:i w:val="0"/>
+                <w:color w:val="FFFFFF"/>
+                <w:sz w:val="14"/>
+              </w:rPr>
+              <w:t>Programme</w:t>
+            </w:r>
+          </w:p>
+        </w:tc>
+        <w:tc>
+          <w:tcPr>
+            <w:tcW w:type="dxa" w:w="2448"/>
+            <w:shd w:val="clear" w:color="auto" w:fill="335D4F"/>
+            <w:vAlign w:val="center"/>
+            <w:tcMar>
+              <w:top w:w="30" w:type="dxa"/>
+              <w:left w:w="70" w:type="dxa"/>
+              <w:bottom w:w="30" w:type="dxa"/>
+              <w:right w:w="70" w:type="dxa"/>
+            </w:tcMar>
+          </w:tcPr>
+          <w:p>
+            <w:pPr>
+              <w:spacing w:before="0" w:after="0" w:line="180" w:lineRule="exact"/>
+            </w:pPr>
+            <w:r/>
+            <w:r>
+              <w:rPr>
+                <w:rFonts w:ascii="Arial" w:hAnsi="Arial" w:cs="Arial" w:eastAsia="Arial"/>
+                <w:b/>
+                <w:i w:val="0"/>
+                <w:color w:val="FFFFFF"/>
+                <w:sz w:val="14"/>
+              </w:rPr>
+              <w:t>Ticket, sourced</w:t>
+            </w:r>
+          </w:p>
+        </w:tc>
+        <w:tc>
+          <w:tcPr>
+            <w:tcW w:type="dxa" w:w="2448"/>
+            <w:shd w:val="clear" w:color="auto" w:fill="335D4F"/>
+            <w:vAlign w:val="center"/>
+            <w:tcMar>
+              <w:top w:w="30" w:type="dxa"/>
+              <w:left w:w="70" w:type="dxa"/>
+              <w:bottom w:w="30" w:type="dxa"/>
+              <w:right w:w="70" w:type="dxa"/>
+            </w:tcMar>
+          </w:tcPr>
+          <w:p>
+            <w:pPr>
+              <w:spacing w:before="0" w:after="0" w:line="180" w:lineRule="exact"/>
+            </w:pPr>
+            <w:r/>
+            <w:r>
+              <w:rPr>
+                <w:rFonts w:ascii="Arial" w:hAnsi="Arial" w:cs="Arial" w:eastAsia="Arial"/>
+                <w:b/>
+                <w:i w:val="0"/>
+                <w:color w:val="FFFFFF"/>
+                <w:sz w:val="14"/>
+              </w:rPr>
+              <w:t>Why it fits</w:t>
+            </w:r>
+          </w:p>
+        </w:tc>
+        <w:tc>
+          <w:tcPr>
+            <w:tcW w:type="dxa" w:w="1872"/>
+            <w:shd w:val="clear" w:color="auto" w:fill="335D4F"/>
+            <w:vAlign w:val="center"/>
+            <w:tcMar>
+              <w:top w:w="30" w:type="dxa"/>
+              <w:left w:w="70" w:type="dxa"/>
+              <w:bottom w:w="30" w:type="dxa"/>
+              <w:right w:w="70" w:type="dxa"/>
+            </w:tcMar>
+          </w:tcPr>
+          <w:p>
+            <w:pPr>
+              <w:spacing w:before="0" w:after="0" w:line="180" w:lineRule="exact"/>
+            </w:pPr>
+            <w:r/>
+            <w:r>
+              <w:rPr>
+                <w:rFonts w:ascii="Arial" w:hAnsi="Arial" w:cs="Arial" w:eastAsia="Arial"/>
+                <w:b/>
+                <w:i w:val="0"/>
+                <w:color w:val="FFFFFF"/>
+                <w:sz w:val="14"/>
+              </w:rPr>
+              <w:t>Source</w:t>
+            </w:r>
+          </w:p>
+        </w:tc>
+      </w:tr>
+      <w:tr>
+        <w:trPr>
+          <w:cantSplit/>
+        </w:trPr>
+        <w:tc>
+          <w:tcPr>
+            <w:tcW w:type="dxa" w:w="1655"/>
+            <w:vAlign w:val="center"/>
+            <w:tcMar>
+              <w:top w:w="30" w:type="dxa"/>
+              <w:left w:w="70" w:type="dxa"/>
+              <w:bottom w:w="30" w:type="dxa"/>
+              <w:right w:w="70" w:type="dxa"/>
+            </w:tcMar>
+          </w:tcPr>
+          <w:p>
+            <w:pPr>
+              <w:spacing w:before="0" w:after="0" w:line="170" w:lineRule="exact"/>
+            </w:pPr>
+            <w:r/>
+            <w:r>
+              <w:rPr>
+                <w:rFonts w:ascii="Arial" w:hAnsi="Arial" w:cs="Arial" w:eastAsia="Arial"/>
+                <w:b/>
+                <w:i w:val="0"/>
+                <w:color w:val="222A27"/>
+                <w:sz w:val="13"/>
+              </w:rPr>
+              <w:t>1. GIZ / BMZ</w:t>
+            </w:r>
+          </w:p>
+        </w:tc>
+        <w:tc>
+          <w:tcPr>
+            <w:tcW w:type="dxa" w:w="2232"/>
+            <w:vAlign w:val="center"/>
+            <w:tcMar>
+              <w:top w:w="30" w:type="dxa"/>
+              <w:left w:w="70" w:type="dxa"/>
+              <w:bottom w:w="30" w:type="dxa"/>
+              <w:right w:w="70" w:type="dxa"/>
+            </w:tcMar>
+          </w:tcPr>
+          <w:p>
+            <w:pPr>
+              <w:spacing w:before="0" w:after="0" w:line="170" w:lineRule="exact"/>
+            </w:pPr>
+            <w:r/>
+            <w:r>
+              <w:rPr>
+                <w:rFonts w:ascii="Arial" w:hAnsi="Arial" w:cs="Arial" w:eastAsia="Arial"/>
+                <w:b w:val="0"/>
+                <w:i w:val="0"/>
+                <w:color w:val="222A27"/>
+                <w:sz w:val="13"/>
+              </w:rPr>
+              <w:t>PFS programme with GCIC at Ashesi University. Green incubation and acceleration.</w:t>
+            </w:r>
+          </w:p>
+        </w:tc>
+        <w:tc>
+          <w:tcPr>
+            <w:tcW w:type="dxa" w:w="2448"/>
+            <w:vAlign w:val="center"/>
+            <w:tcMar>
+              <w:top w:w="30" w:type="dxa"/>
+              <w:left w:w="70" w:type="dxa"/>
+              <w:bottom w:w="30" w:type="dxa"/>
+              <w:right w:w="70" w:type="dxa"/>
+            </w:tcMar>
+          </w:tcPr>
+          <w:p>
+            <w:pPr>
+              <w:spacing w:before="0" w:after="0" w:line="170" w:lineRule="exact"/>
+            </w:pPr>
+            <w:r/>
+            <w:r>
+              <w:rPr>
+                <w:rFonts w:ascii="Arial" w:hAnsi="Arial" w:cs="Arial" w:eastAsia="Arial"/>
+                <w:b w:val="0"/>
+                <w:i w:val="0"/>
+                <w:color w:val="222A27"/>
+                <w:sz w:val="13"/>
+              </w:rPr>
+              <w:t>About EUR 1.2 million for the 2024 partnership. Each business can get up to EUR 10,000. Not a US dollar figure.</w:t>
+            </w:r>
+          </w:p>
+        </w:tc>
+        <w:tc>
+          <w:tcPr>
+            <w:tcW w:type="dxa" w:w="2448"/>
+            <w:vAlign w:val="center"/>
+            <w:tcMar>
+              <w:top w:w="30" w:type="dxa"/>
+              <w:left w:w="70" w:type="dxa"/>
+              <w:bottom w:w="30" w:type="dxa"/>
+              <w:right w:w="70" w:type="dxa"/>
+            </w:tcMar>
+          </w:tcPr>
+          <w:p>
+            <w:pPr>
+              <w:spacing w:before="0" w:after="0" w:line="170" w:lineRule="exact"/>
+            </w:pPr>
+            <w:r/>
+            <w:r>
+              <w:rPr>
+                <w:rFonts w:ascii="Arial" w:hAnsi="Arial" w:cs="Arial" w:eastAsia="Arial"/>
+                <w:b w:val="0"/>
+                <w:i w:val="0"/>
+                <w:color w:val="222A27"/>
+                <w:sz w:val="13"/>
+              </w:rPr>
+              <w:t>Closest public match: a Ghana university climate incubator, at a size that covers this ask.</w:t>
+            </w:r>
+          </w:p>
+        </w:tc>
+        <w:tc>
+          <w:tcPr>
+            <w:tcW w:type="dxa" w:w="1872"/>
+            <w:vAlign w:val="center"/>
+            <w:tcMar>
+              <w:top w:w="30" w:type="dxa"/>
+              <w:left w:w="70" w:type="dxa"/>
+              <w:bottom w:w="30" w:type="dxa"/>
+              <w:right w:w="70" w:type="dxa"/>
+            </w:tcMar>
+          </w:tcPr>
+          <w:p>
+            <w:pPr>
+              <w:spacing w:before="0" w:after="0" w:line="170" w:lineRule="exact"/>
+            </w:pPr>
+            <w:r/>
+            <w:r>
+              <w:rPr>
+                <w:rFonts w:ascii="Arial" w:hAnsi="Arial" w:cs="Arial" w:eastAsia="Arial"/>
+                <w:b w:val="0"/>
+                <w:i w:val="0"/>
+                <w:color w:val="222A27"/>
+                <w:sz w:val="13"/>
+              </w:rPr>
+              <w:t>https://ghanacic.ashesi.edu.gh/giz-partners-with-ashesis-gcic-towards-green-entrepreneurship-development/</w:t>
+            </w:r>
+          </w:p>
+        </w:tc>
+      </w:tr>
+      <w:tr>
+        <w:trPr>
+          <w:cantSplit/>
+        </w:trPr>
+        <w:tc>
+          <w:tcPr>
+            <w:tcW w:type="dxa" w:w="1655"/>
+            <w:vAlign w:val="center"/>
+            <w:tcMar>
+              <w:top w:w="30" w:type="dxa"/>
+              <w:left w:w="70" w:type="dxa"/>
+              <w:bottom w:w="30" w:type="dxa"/>
+              <w:right w:w="70" w:type="dxa"/>
+            </w:tcMar>
+          </w:tcPr>
+          <w:p>
+            <w:pPr>
+              <w:spacing w:before="0" w:after="0" w:line="170" w:lineRule="exact"/>
+            </w:pPr>
+            <w:r/>
+            <w:r>
+              <w:rPr>
+                <w:rFonts w:ascii="Arial" w:hAnsi="Arial" w:cs="Arial" w:eastAsia="Arial"/>
+                <w:b/>
+                <w:i w:val="0"/>
+                <w:color w:val="222A27"/>
+                <w:sz w:val="13"/>
+              </w:rPr>
+              <w:t>2. Global Affairs Canada</w:t>
+            </w:r>
+          </w:p>
+        </w:tc>
+        <w:tc>
+          <w:tcPr>
+            <w:tcW w:type="dxa" w:w="2232"/>
+            <w:vAlign w:val="center"/>
+            <w:tcMar>
+              <w:top w:w="30" w:type="dxa"/>
+              <w:left w:w="70" w:type="dxa"/>
+              <w:bottom w:w="30" w:type="dxa"/>
+              <w:right w:w="70" w:type="dxa"/>
+            </w:tcMar>
+          </w:tcPr>
+          <w:p>
+            <w:pPr>
+              <w:spacing w:before="0" w:after="0" w:line="170" w:lineRule="exact"/>
+            </w:pPr>
+            <w:r/>
+            <w:r>
+              <w:rPr>
+                <w:rFonts w:ascii="Arial" w:hAnsi="Arial" w:cs="Arial" w:eastAsia="Arial"/>
+                <w:b w:val="0"/>
+                <w:i w:val="0"/>
+                <w:color w:val="222A27"/>
+                <w:sz w:val="13"/>
+              </w:rPr>
+              <w:t>Supporting the Green Economy of Ghana, through GCIC at Ashesi University.</w:t>
+            </w:r>
+          </w:p>
+        </w:tc>
+        <w:tc>
+          <w:tcPr>
+            <w:tcW w:type="dxa" w:w="2448"/>
+            <w:vAlign w:val="center"/>
+            <w:tcMar>
+              <w:top w:w="30" w:type="dxa"/>
+              <w:left w:w="70" w:type="dxa"/>
+              <w:bottom w:w="30" w:type="dxa"/>
+              <w:right w:w="70" w:type="dxa"/>
+            </w:tcMar>
+          </w:tcPr>
+          <w:p>
+            <w:pPr>
+              <w:spacing w:before="0" w:after="0" w:line="170" w:lineRule="exact"/>
+            </w:pPr>
+            <w:r/>
+            <w:r>
+              <w:rPr>
+                <w:rFonts w:ascii="Arial" w:hAnsi="Arial" w:cs="Arial" w:eastAsia="Arial"/>
+                <w:b w:val="0"/>
+                <w:i w:val="0"/>
+                <w:color w:val="222A27"/>
+                <w:sz w:val="13"/>
+              </w:rPr>
+              <w:t>Maximum contribution $10,000,000 on the Canada project browser (Canadian dollars), 23 Aug 2021 to 31 Mar 2026. Larger than this ask. A follow-on is UNVERIFIED.</w:t>
+            </w:r>
+          </w:p>
+        </w:tc>
+        <w:tc>
+          <w:tcPr>
+            <w:tcW w:type="dxa" w:w="2448"/>
+            <w:vAlign w:val="center"/>
+            <w:tcMar>
+              <w:top w:w="30" w:type="dxa"/>
+              <w:left w:w="70" w:type="dxa"/>
+              <w:bottom w:w="30" w:type="dxa"/>
+              <w:right w:w="70" w:type="dxa"/>
+            </w:tcMar>
+          </w:tcPr>
+          <w:p>
+            <w:pPr>
+              <w:spacing w:before="0" w:after="0" w:line="170" w:lineRule="exact"/>
+            </w:pPr>
+            <w:r/>
+            <w:r>
+              <w:rPr>
+                <w:rFonts w:ascii="Arial" w:hAnsi="Arial" w:cs="Arial" w:eastAsia="Arial"/>
+                <w:b w:val="0"/>
+                <w:i w:val="0"/>
+                <w:color w:val="222A27"/>
+                <w:sz w:val="13"/>
+              </w:rPr>
+              <w:t>Published multi-year grant to a Ghanaian university for climate entrepreneurship.</w:t>
+            </w:r>
+          </w:p>
+        </w:tc>
+        <w:tc>
+          <w:tcPr>
+            <w:tcW w:type="dxa" w:w="1872"/>
+            <w:vAlign w:val="center"/>
+            <w:tcMar>
+              <w:top w:w="30" w:type="dxa"/>
+              <w:left w:w="70" w:type="dxa"/>
+              <w:bottom w:w="30" w:type="dxa"/>
+              <w:right w:w="70" w:type="dxa"/>
+            </w:tcMar>
+          </w:tcPr>
+          <w:p>
+            <w:pPr>
+              <w:spacing w:before="0" w:after="0" w:line="170" w:lineRule="exact"/>
+            </w:pPr>
+            <w:r/>
+            <w:r>
+              <w:rPr>
+                <w:rFonts w:ascii="Arial" w:hAnsi="Arial" w:cs="Arial" w:eastAsia="Arial"/>
+                <w:b w:val="0"/>
+                <w:i w:val="0"/>
+                <w:color w:val="222A27"/>
+                <w:sz w:val="13"/>
+              </w:rPr>
+              <w:t>https://w05.international.gc.ca/projectbrowser-banqueprojets/project-projet/details/p008970001</w:t>
+            </w:r>
+          </w:p>
+        </w:tc>
+      </w:tr>
+      <w:tr>
+        <w:trPr>
+          <w:cantSplit/>
+        </w:trPr>
+        <w:tc>
+          <w:tcPr>
+            <w:tcW w:type="dxa" w:w="1655"/>
+            <w:vAlign w:val="center"/>
+            <w:tcMar>
+              <w:top w:w="30" w:type="dxa"/>
+              <w:left w:w="70" w:type="dxa"/>
+              <w:bottom w:w="30" w:type="dxa"/>
+              <w:right w:w="70" w:type="dxa"/>
+            </w:tcMar>
+          </w:tcPr>
+          <w:p>
+            <w:pPr>
+              <w:spacing w:before="0" w:after="0" w:line="170" w:lineRule="exact"/>
+            </w:pPr>
+            <w:r/>
+            <w:r>
+              <w:rPr>
+                <w:rFonts w:ascii="Arial" w:hAnsi="Arial" w:cs="Arial" w:eastAsia="Arial"/>
+                <w:b/>
+                <w:i w:val="0"/>
+                <w:color w:val="222A27"/>
+                <w:sz w:val="13"/>
+              </w:rPr>
+              <w:t>3. AfDB, YEI MDTF and FAPA</w:t>
+            </w:r>
+          </w:p>
+        </w:tc>
+        <w:tc>
+          <w:tcPr>
+            <w:tcW w:type="dxa" w:w="2232"/>
+            <w:vAlign w:val="center"/>
+            <w:tcMar>
+              <w:top w:w="30" w:type="dxa"/>
+              <w:left w:w="70" w:type="dxa"/>
+              <w:bottom w:w="30" w:type="dxa"/>
+              <w:right w:w="70" w:type="dxa"/>
+            </w:tcMar>
+          </w:tcPr>
+          <w:p>
+            <w:pPr>
+              <w:spacing w:before="0" w:after="0" w:line="170" w:lineRule="exact"/>
+            </w:pPr>
+            <w:r/>
+            <w:r>
+              <w:rPr>
+                <w:rFonts w:ascii="Arial" w:hAnsi="Arial" w:cs="Arial" w:eastAsia="Arial"/>
+                <w:b w:val="0"/>
+                <w:i w:val="0"/>
+                <w:color w:val="222A27"/>
+                <w:sz w:val="13"/>
+              </w:rPr>
+              <w:t>MicroGREEN. Green jobs for youth and women in Ghana and Senegal. Implementer: Invest in Africa.</w:t>
+            </w:r>
+          </w:p>
+        </w:tc>
+        <w:tc>
+          <w:tcPr>
+            <w:tcW w:type="dxa" w:w="2448"/>
+            <w:vAlign w:val="center"/>
+            <w:tcMar>
+              <w:top w:w="30" w:type="dxa"/>
+              <w:left w:w="70" w:type="dxa"/>
+              <w:bottom w:w="30" w:type="dxa"/>
+              <w:right w:w="70" w:type="dxa"/>
+            </w:tcMar>
+          </w:tcPr>
+          <w:p>
+            <w:pPr>
+              <w:spacing w:before="0" w:after="0" w:line="170" w:lineRule="exact"/>
+            </w:pPr>
+            <w:r/>
+            <w:r>
+              <w:rPr>
+                <w:rFonts w:ascii="Arial" w:hAnsi="Arial" w:cs="Arial" w:eastAsia="Arial"/>
+                <w:b w:val="0"/>
+                <w:i w:val="0"/>
+                <w:color w:val="222A27"/>
+                <w:sz w:val="13"/>
+              </w:rPr>
+              <w:t>US$850,000 FAPA grant (11 Aug 2025), plus an initial US$1 million YEI MDTF commitment. Ghana and Senegal share the project.</w:t>
+            </w:r>
+          </w:p>
+        </w:tc>
+        <w:tc>
+          <w:tcPr>
+            <w:tcW w:type="dxa" w:w="2448"/>
+            <w:vAlign w:val="center"/>
+            <w:tcMar>
+              <w:top w:w="30" w:type="dxa"/>
+              <w:left w:w="70" w:type="dxa"/>
+              <w:bottom w:w="30" w:type="dxa"/>
+              <w:right w:w="70" w:type="dxa"/>
+            </w:tcMar>
+          </w:tcPr>
+          <w:p>
+            <w:pPr>
+              <w:spacing w:before="0" w:after="0" w:line="170" w:lineRule="exact"/>
+            </w:pPr>
+            <w:r/>
+            <w:r>
+              <w:rPr>
+                <w:rFonts w:ascii="Arial" w:hAnsi="Arial" w:cs="Arial" w:eastAsia="Arial"/>
+                <w:b w:val="0"/>
+                <w:i w:val="0"/>
+                <w:color w:val="222A27"/>
+                <w:sz w:val="13"/>
+              </w:rPr>
+              <w:t>Programme grants in the target band, already in Ghana. A grant to a university is UNVERIFIED.</w:t>
+            </w:r>
+          </w:p>
+        </w:tc>
+        <w:tc>
+          <w:tcPr>
+            <w:tcW w:type="dxa" w:w="1872"/>
+            <w:vAlign w:val="center"/>
+            <w:tcMar>
+              <w:top w:w="30" w:type="dxa"/>
+              <w:left w:w="70" w:type="dxa"/>
+              <w:bottom w:w="30" w:type="dxa"/>
+              <w:right w:w="70" w:type="dxa"/>
+            </w:tcMar>
+          </w:tcPr>
+          <w:p>
+            <w:pPr>
+              <w:spacing w:before="0" w:after="0" w:line="170" w:lineRule="exact"/>
+            </w:pPr>
+            <w:r/>
+            <w:r>
+              <w:rPr>
+                <w:rFonts w:ascii="Arial" w:hAnsi="Arial" w:cs="Arial" w:eastAsia="Arial"/>
+                <w:b w:val="0"/>
+                <w:i w:val="0"/>
+                <w:color w:val="222A27"/>
+                <w:sz w:val="13"/>
+              </w:rPr>
+              <w:t>https://www.afdb.org/en/news-and-events/press-releases/african-development-bank-and-invest-africa-sign-850000-grant-agreement-boost-inclusive-green-jobs-ghana-and-senegal-85980</w:t>
+            </w:r>
+          </w:p>
+        </w:tc>
+      </w:tr>
+      <w:tr>
+        <w:trPr>
+          <w:cantSplit/>
+        </w:trPr>
+        <w:tc>
+          <w:tcPr>
+            <w:tcW w:type="dxa" w:w="1655"/>
+            <w:vAlign w:val="center"/>
+            <w:tcMar>
+              <w:top w:w="30" w:type="dxa"/>
+              <w:left w:w="70" w:type="dxa"/>
+              <w:bottom w:w="30" w:type="dxa"/>
+              <w:right w:w="70" w:type="dxa"/>
+            </w:tcMar>
+          </w:tcPr>
+          <w:p>
+            <w:pPr>
+              <w:spacing w:before="0" w:after="0" w:line="170" w:lineRule="exact"/>
+            </w:pPr>
+            <w:r/>
+            <w:r>
+              <w:rPr>
+                <w:rFonts w:ascii="Arial" w:hAnsi="Arial" w:cs="Arial" w:eastAsia="Arial"/>
+                <w:b/>
+                <w:i w:val="0"/>
+                <w:color w:val="222A27"/>
+                <w:sz w:val="13"/>
+              </w:rPr>
+              <w:t>4. Danida</w:t>
+            </w:r>
+          </w:p>
+        </w:tc>
+        <w:tc>
+          <w:tcPr>
+            <w:tcW w:type="dxa" w:w="2232"/>
+            <w:vAlign w:val="center"/>
+            <w:tcMar>
+              <w:top w:w="30" w:type="dxa"/>
+              <w:left w:w="70" w:type="dxa"/>
+              <w:bottom w:w="30" w:type="dxa"/>
+              <w:right w:w="70" w:type="dxa"/>
+            </w:tcMar>
+          </w:tcPr>
+          <w:p>
+            <w:pPr>
+              <w:spacing w:before="0" w:after="0" w:line="170" w:lineRule="exact"/>
+            </w:pPr>
+            <w:r/>
+            <w:r>
+              <w:rPr>
+                <w:rFonts w:ascii="Arial" w:hAnsi="Arial" w:cs="Arial" w:eastAsia="Arial"/>
+                <w:b w:val="0"/>
+                <w:i w:val="0"/>
+                <w:color w:val="222A27"/>
+                <w:sz w:val="13"/>
+              </w:rPr>
+              <w:t>Danida Green Business Partnerships, 2025 round. Climate adaptation. Ghana is eligible.</w:t>
+            </w:r>
+          </w:p>
+        </w:tc>
+        <w:tc>
+          <w:tcPr>
+            <w:tcW w:type="dxa" w:w="2448"/>
+            <w:vAlign w:val="center"/>
+            <w:tcMar>
+              <w:top w:w="30" w:type="dxa"/>
+              <w:left w:w="70" w:type="dxa"/>
+              <w:bottom w:w="30" w:type="dxa"/>
+              <w:right w:w="70" w:type="dxa"/>
+            </w:tcMar>
+          </w:tcPr>
+          <w:p>
+            <w:pPr>
+              <w:spacing w:before="0" w:after="0" w:line="170" w:lineRule="exact"/>
+            </w:pPr>
+            <w:r/>
+            <w:r>
+              <w:rPr>
+                <w:rFonts w:ascii="Arial" w:hAnsi="Arial" w:cs="Arial" w:eastAsia="Arial"/>
+                <w:b w:val="0"/>
+                <w:i w:val="0"/>
+                <w:color w:val="222A27"/>
+                <w:sz w:val="13"/>
+              </w:rPr>
+              <w:t>DKK 4 million to 15 million, for 3 to 5 years. Published in kroner, not US dollars. A US dollar conversion is UNVERIFIED.</w:t>
+            </w:r>
+          </w:p>
+        </w:tc>
+        <w:tc>
+          <w:tcPr>
+            <w:tcW w:type="dxa" w:w="2448"/>
+            <w:vAlign w:val="center"/>
+            <w:tcMar>
+              <w:top w:w="30" w:type="dxa"/>
+              <w:left w:w="70" w:type="dxa"/>
+              <w:bottom w:w="30" w:type="dxa"/>
+              <w:right w:w="70" w:type="dxa"/>
+            </w:tcMar>
+          </w:tcPr>
+          <w:p>
+            <w:pPr>
+              <w:spacing w:before="0" w:after="0" w:line="170" w:lineRule="exact"/>
+            </w:pPr>
+            <w:r/>
+            <w:r>
+              <w:rPr>
+                <w:rFonts w:ascii="Arial" w:hAnsi="Arial" w:cs="Arial" w:eastAsia="Arial"/>
+                <w:b w:val="0"/>
+                <w:i w:val="0"/>
+                <w:color w:val="222A27"/>
+                <w:sz w:val="13"/>
+              </w:rPr>
+              <w:t>Size and theme fit. The 2025 rules say a university cannot be the administrative partner, and an international commercial partner is required.</w:t>
+            </w:r>
+          </w:p>
+        </w:tc>
+        <w:tc>
+          <w:tcPr>
+            <w:tcW w:type="dxa" w:w="1872"/>
+            <w:vAlign w:val="center"/>
+            <w:tcMar>
+              <w:top w:w="30" w:type="dxa"/>
+              <w:left w:w="70" w:type="dxa"/>
+              <w:bottom w:w="30" w:type="dxa"/>
+              <w:right w:w="70" w:type="dxa"/>
+            </w:tcMar>
+          </w:tcPr>
+          <w:p>
+            <w:pPr>
+              <w:spacing w:before="0" w:after="0" w:line="170" w:lineRule="exact"/>
+            </w:pPr>
+            <w:r/>
+            <w:r>
+              <w:rPr>
+                <w:rFonts w:ascii="Arial" w:hAnsi="Arial" w:cs="Arial" w:eastAsia="Arial"/>
+                <w:b w:val="0"/>
+                <w:i w:val="0"/>
+                <w:color w:val="222A27"/>
+                <w:sz w:val="13"/>
+              </w:rPr>
+              <w:t>https://danida-business-partnerships.dk/wp-content/uploads/2025/01/DGBP-2025-Guidelines-read-these-if-you-want-to-apply.pdf</w:t>
+            </w:r>
+          </w:p>
+        </w:tc>
+      </w:tr>
+      <w:tr>
+        <w:trPr>
+          <w:cantSplit/>
+        </w:trPr>
+        <w:tc>
+          <w:tcPr>
+            <w:tcW w:type="dxa" w:w="1655"/>
+            <w:vAlign w:val="center"/>
+            <w:tcMar>
+              <w:top w:w="30" w:type="dxa"/>
+              <w:left w:w="70" w:type="dxa"/>
+              <w:bottom w:w="30" w:type="dxa"/>
+              <w:right w:w="70" w:type="dxa"/>
+            </w:tcMar>
+          </w:tcPr>
+          <w:p>
+            <w:pPr>
+              <w:spacing w:before="0" w:after="0" w:line="170" w:lineRule="exact"/>
+            </w:pPr>
+            <w:r/>
+            <w:r>
+              <w:rPr>
+                <w:rFonts w:ascii="Arial" w:hAnsi="Arial" w:cs="Arial" w:eastAsia="Arial"/>
+                <w:b/>
+                <w:i w:val="0"/>
+                <w:color w:val="222A27"/>
+                <w:sz w:val="13"/>
+              </w:rPr>
+              <w:t>5. Mastercard Foundation</w:t>
+            </w:r>
+          </w:p>
+        </w:tc>
+        <w:tc>
+          <w:tcPr>
+            <w:tcW w:type="dxa" w:w="2232"/>
+            <w:vAlign w:val="center"/>
+            <w:tcMar>
+              <w:top w:w="30" w:type="dxa"/>
+              <w:left w:w="70" w:type="dxa"/>
+              <w:bottom w:w="30" w:type="dxa"/>
+              <w:right w:w="70" w:type="dxa"/>
+            </w:tcMar>
+          </w:tcPr>
+          <w:p>
+            <w:pPr>
+              <w:spacing w:before="0" w:after="0" w:line="170" w:lineRule="exact"/>
+            </w:pPr>
+            <w:r/>
+            <w:r>
+              <w:rPr>
+                <w:rFonts w:ascii="Arial" w:hAnsi="Arial" w:cs="Arial" w:eastAsia="Arial"/>
+                <w:b w:val="0"/>
+                <w:i w:val="0"/>
+                <w:color w:val="222A27"/>
+                <w:sz w:val="13"/>
+              </w:rPr>
+              <w:t>Climate Impact Challenge Fund, inside the Fund for Resilience and Prosperity. Ghana is a focus country.</w:t>
+            </w:r>
+          </w:p>
+        </w:tc>
+        <w:tc>
+          <w:tcPr>
+            <w:tcW w:type="dxa" w:w="2448"/>
+            <w:vAlign w:val="center"/>
+            <w:tcMar>
+              <w:top w:w="30" w:type="dxa"/>
+              <w:left w:w="70" w:type="dxa"/>
+              <w:bottom w:w="30" w:type="dxa"/>
+              <w:right w:w="70" w:type="dxa"/>
+            </w:tcMar>
+          </w:tcPr>
+          <w:p>
+            <w:pPr>
+              <w:spacing w:before="0" w:after="0" w:line="170" w:lineRule="exact"/>
+            </w:pPr>
+            <w:r/>
+            <w:r>
+              <w:rPr>
+                <w:rFonts w:ascii="Arial" w:hAnsi="Arial" w:cs="Arial" w:eastAsia="Arial"/>
+                <w:b w:val="0"/>
+                <w:i w:val="0"/>
+                <w:color w:val="222A27"/>
+                <w:sz w:val="13"/>
+              </w:rPr>
+              <w:t>US$250,000 to US$1,500,000 over three years.</w:t>
+            </w:r>
+          </w:p>
+        </w:tc>
+        <w:tc>
+          <w:tcPr>
+            <w:tcW w:type="dxa" w:w="2448"/>
+            <w:vAlign w:val="center"/>
+            <w:tcMar>
+              <w:top w:w="30" w:type="dxa"/>
+              <w:left w:w="70" w:type="dxa"/>
+              <w:bottom w:w="30" w:type="dxa"/>
+              <w:right w:w="70" w:type="dxa"/>
+            </w:tcMar>
+          </w:tcPr>
+          <w:p>
+            <w:pPr>
+              <w:spacing w:before="0" w:after="0" w:line="170" w:lineRule="exact"/>
+            </w:pPr>
+            <w:r/>
+            <w:r>
+              <w:rPr>
+                <w:rFonts w:ascii="Arial" w:hAnsi="Arial" w:cs="Arial" w:eastAsia="Arial"/>
+                <w:b w:val="0"/>
+                <w:i w:val="0"/>
+                <w:color w:val="222A27"/>
+                <w:sz w:val="13"/>
+              </w:rPr>
+              <w:t>Ticket covers the band. Rules require a for-profit SME with at least 3 years of operations, so this fits cohort firms, not the university host. A hub grant is UNVERIFIED.</w:t>
+            </w:r>
+          </w:p>
+        </w:tc>
+        <w:tc>
+          <w:tcPr>
+            <w:tcW w:type="dxa" w:w="1872"/>
+            <w:vAlign w:val="center"/>
+            <w:tcMar>
+              <w:top w:w="30" w:type="dxa"/>
+              <w:left w:w="70" w:type="dxa"/>
+              <w:bottom w:w="30" w:type="dxa"/>
+              <w:right w:w="70" w:type="dxa"/>
+            </w:tcMar>
+          </w:tcPr>
+          <w:p>
+            <w:pPr>
+              <w:spacing w:before="0" w:after="0" w:line="170" w:lineRule="exact"/>
+            </w:pPr>
+            <w:r/>
+            <w:r>
+              <w:rPr>
+                <w:rFonts w:ascii="Arial" w:hAnsi="Arial" w:cs="Arial" w:eastAsia="Arial"/>
+                <w:b w:val="0"/>
+                <w:i w:val="0"/>
+                <w:color w:val="222A27"/>
+                <w:sz w:val="13"/>
+              </w:rPr>
+              <w:t>https://frp.org/sites/default/files/2024-11/Climate%20Impact%20Challenge%20Fund_summary.pdf</w:t>
+            </w:r>
+          </w:p>
+        </w:tc>
+      </w:tr>
+    </w:tbl>
+    <w:p>
+      <w:pPr>
+        <w:spacing w:before="40" w:after="0" w:line="200" w:lineRule="exact"/>
+      </w:pPr>
+      <w:r>
+        <w:rPr>
+          <w:rFonts w:ascii="Georgia" w:hAnsi="Georgia" w:cs="Georgia" w:eastAsia="Georgia"/>
+          <w:b w:val="0"/>
+          <w:i w:val="0"/>
+          <w:color w:val="222A27"/>
+          <w:sz w:val="16"/>
+        </w:rPr>
+        <w:t>Not ranked. USAID: a March 2025 Appropriations letter states that 86% of USAID awards were terminated (https://storage.courtlistener.com/recap/gov.uscourts.dcd.277562/gov.uscourts.dcd.277562.39.18.pdf). Do not plan a new USAID hub grant on the old pipeline. Below this band: FCDO TRANSFORM at GBP 100,000 per enterprise; EU Joint Innovation Facility at EUR 100,000 to 250,000; Orange Corners Ghana at up to EUR 50,000 per entrepreneur. UNDP Ghana Climate Promise is a US$864,000 project with low-value grants. Rockefeller funded the African School of Regulation in Accra at US$1 million (2023) and US$3 million (2024): energy regulation, not a startup hub. SECO GPSCP II is CHF 9 million for cashew and oil palm.</w:t>
+      </w:r>
+    </w:p>
     <w:sectPr>
       <w:footerReference w:type="default" r:id="rId10"/>
       <w:pgSz w:w="12240" w:h="15840"/>

</xml_diff>

<commit_message>
Apply Gideon edits to the Laurence one-pager timeline.
Drop the open-points section and lock January to March 2027 as the confirmed Year 1 start.

Co-authored-by: gideonblaauw-creator <gideonblaauw-creator@users.noreply.github.com>
</commit_message>
<xml_diff>
--- a/archive/rein-hubs/2026-10-20-laurence-ghana-onepager.docx
+++ b/archive/rein-hubs/2026-10-20-laurence-ghana-onepager.docx
@@ -1408,117 +1408,6 @@
       </w:r>
     </w:p>
     <w:p>
-      <w:pPr>
-        <w:keepNext/>
-        <w:spacing w:before="120" w:after="20" w:line="280" w:lineRule="exact"/>
-      </w:pPr>
-      <w:r>
-        <w:rPr>
-          <w:rFonts w:ascii="Arial" w:hAnsi="Arial" w:cs="Arial" w:eastAsia="Arial"/>
-          <w:b/>
-          <w:i w:val="0"/>
-          <w:color w:val="335D4F"/>
-          <w:sz w:val="24"/>
-        </w:rPr>
-        <w:t>3. To agree with Laurence before Pav</w:t>
-      </w:r>
-    </w:p>
-    <w:p>
-      <w:pPr>
-        <w:spacing w:before="20" w:after="0" w:line="260" w:lineRule="exact"/>
-      </w:pPr>
-      <w:r>
-        <w:rPr>
-          <w:rFonts w:ascii="Arial" w:hAnsi="Arial" w:cs="Arial" w:eastAsia="Arial"/>
-          <w:b/>
-          <w:i w:val="0"/>
-          <w:color w:val="335D4F"/>
-          <w:sz w:val="20"/>
-        </w:rPr>
-        <w:t xml:space="preserve">a. </w:t>
-      </w:r>
-      <w:r>
-        <w:rPr>
-          <w:rFonts w:ascii="Georgia" w:hAnsi="Georgia" w:cs="Georgia" w:eastAsia="Georgia"/>
-          <w:b w:val="0"/>
-          <w:i w:val="0"/>
-          <w:color w:val="222A27"/>
-          <w:sz w:val="20"/>
-        </w:rPr>
-        <w:t>Year 1 cost split across PVBLIC, ACity, and FOSD. Unconfirmed.</w:t>
-      </w:r>
-    </w:p>
-    <w:p>
-      <w:pPr>
-        <w:spacing w:before="20" w:after="0" w:line="260" w:lineRule="exact"/>
-      </w:pPr>
-      <w:r>
-        <w:rPr>
-          <w:rFonts w:ascii="Arial" w:hAnsi="Arial" w:cs="Arial" w:eastAsia="Arial"/>
-          <w:b/>
-          <w:i w:val="0"/>
-          <w:color w:val="335D4F"/>
-          <w:sz w:val="20"/>
-        </w:rPr>
-        <w:t xml:space="preserve">b. </w:t>
-      </w:r>
-      <w:r>
-        <w:rPr>
-          <w:rFonts w:ascii="Georgia" w:hAnsi="Georgia" w:cs="Georgia" w:eastAsia="Georgia"/>
-          <w:b w:val="0"/>
-          <w:i w:val="0"/>
-          <w:color w:val="222A27"/>
-          <w:sz w:val="20"/>
-        </w:rPr>
-        <w:t xml:space="preserve">Can Pav put a value on the in-kind contribution? </w:t>
-      </w:r>
-      <w:r>
-        <w:rPr>
-          <w:rFonts w:ascii="Arial" w:hAnsi="Arial" w:cs="Arial" w:eastAsia="Arial"/>
-          <w:b/>
-          <w:i w:val="0"/>
-          <w:color w:val="FF6633"/>
-          <w:sz w:val="20"/>
-        </w:rPr>
-        <w:t>TO CONFIRM</w:t>
-      </w:r>
-    </w:p>
-    <w:p>
-      <w:pPr>
-        <w:spacing w:before="20" w:after="0" w:line="260" w:lineRule="exact"/>
-      </w:pPr>
-      <w:r>
-        <w:rPr>
-          <w:rFonts w:ascii="Arial" w:hAnsi="Arial" w:cs="Arial" w:eastAsia="Arial"/>
-          <w:b/>
-          <w:i w:val="0"/>
-          <w:color w:val="335D4F"/>
-          <w:sz w:val="20"/>
-        </w:rPr>
-        <w:t xml:space="preserve">c. </w:t>
-      </w:r>
-      <w:r>
-        <w:rPr>
-          <w:rFonts w:ascii="Georgia" w:hAnsi="Georgia" w:cs="Georgia" w:eastAsia="Georgia"/>
-          <w:b w:val="0"/>
-          <w:i w:val="0"/>
-          <w:color w:val="222A27"/>
-          <w:sz w:val="20"/>
-        </w:rPr>
-        <w:t xml:space="preserve">What reduces in Years 2 and 3? The breakdown is not yet set. </w:t>
-      </w:r>
-      <w:r>
-        <w:rPr>
-          <w:rFonts w:ascii="Arial" w:hAnsi="Arial" w:cs="Arial" w:eastAsia="Arial"/>
-          <w:b/>
-          <w:i w:val="0"/>
-          <w:color w:val="FF6633"/>
-          <w:sz w:val="20"/>
-        </w:rPr>
-        <w:t>TO CONFIRM</w:t>
-      </w:r>
-    </w:p>
-    <w:p>
       <w:r>
         <w:br w:type="page"/>
       </w:r>
@@ -1536,7 +1425,7 @@
           <w:color w:val="335D4F"/>
           <w:sz w:val="24"/>
         </w:rPr>
-        <w:t>4. Timeline</w:t>
+        <w:t>3. Timeline</w:t>
       </w:r>
     </w:p>
     <w:p>
@@ -1551,189 +1440,9 @@
           <w:color w:val="222A27"/>
           <w:sz w:val="18"/>
         </w:rPr>
-        <w:t>Stages run back to back: Ideation 4 weeks, Incubation 10 weeks, Acceleration 12 weeks, Growth 12 weeks (38 weeks). Only the Pav meeting date and the UNGA82 calendar are fixed below. Every other date is TO CONFIRM.</w:t>
+        <w:t>Gideon has confirmed the Q1 2027 launch: January 2027 is the design month, February 2027 is on-site training, and March 2027 is the start of Incubation. Ideation (4 weeks) sits inside February with that training, so it still comes before Incubation. That February placement is an assumption. Acceleration (12 weeks) and Growth (12 weeks) follow in sequence.</w:t>
       </w:r>
     </w:p>
-    <w:tbl>
-      <w:tblPr>
-        <w:tblW w:type="dxa" w:w="10656"/>
-        <w:tblLayout w:type="fixed"/>
-        <w:tblLook w:firstColumn="1" w:firstRow="1" w:lastColumn="0" w:lastRow="0" w:noHBand="0" w:noVBand="1" w:val="04A0"/>
-        <w:tblBorders>
-          <w:top w:val="single" w:sz="4" w:space="0" w:color="335D4F"/>
-          <w:left w:val="single" w:sz="4" w:space="0" w:color="335D4F"/>
-          <w:bottom w:val="single" w:sz="4" w:space="0" w:color="335D4F"/>
-          <w:right w:val="single" w:sz="4" w:space="0" w:color="335D4F"/>
-          <w:insideH w:val="single" w:sz="4" w:space="0" w:color="335D4F"/>
-          <w:insideV w:val="single" w:sz="4" w:space="0" w:color="335D4F"/>
-        </w:tblBorders>
-      </w:tblPr>
-      <w:tblGrid>
-        <w:gridCol w:w="3542"/>
-        <w:gridCol w:w="3556"/>
-        <w:gridCol w:w="3556"/>
-      </w:tblGrid>
-      <w:tr>
-        <w:trPr>
-          <w:cantSplit/>
-        </w:trPr>
-        <w:tc>
-          <w:tcPr>
-            <w:tcW w:type="dxa" w:w="3542"/>
-            <w:shd w:val="clear" w:color="auto" w:fill="335D4F"/>
-            <w:vAlign w:val="center"/>
-            <w:tcMar>
-              <w:top w:w="26" w:type="dxa"/>
-              <w:left w:w="40" w:type="dxa"/>
-              <w:bottom w:w="26" w:type="dxa"/>
-              <w:right w:w="40" w:type="dxa"/>
-            </w:tcMar>
-          </w:tcPr>
-          <w:p>
-            <w:pPr>
-              <w:spacing w:before="0" w:after="0" w:line="190" w:lineRule="exact"/>
-              <w:jc w:val="center"/>
-            </w:pPr>
-            <w:r/>
-            <w:r>
-              <w:rPr>
-                <w:rFonts w:ascii="Arial" w:hAnsi="Arial" w:cs="Arial" w:eastAsia="Arial"/>
-                <w:b/>
-                <w:i w:val="0"/>
-                <w:color w:val="FFFFFF"/>
-                <w:sz w:val="16"/>
-              </w:rPr>
-              <w:t>21 Oct 2026</w:t>
-            </w:r>
-            <w:r>
-              <w:br/>
-            </w:r>
-            <w:r>
-              <w:rPr>
-                <w:rFonts w:ascii="Arial" w:hAnsi="Arial" w:cs="Arial" w:eastAsia="Arial"/>
-                <w:b w:val="0"/>
-                <w:i w:val="0"/>
-                <w:color w:val="FFFFFF"/>
-                <w:sz w:val="16"/>
-              </w:rPr>
-              <w:t>Meeting with Pav</w:t>
-            </w:r>
-          </w:p>
-        </w:tc>
-        <w:tc>
-          <w:tcPr>
-            <w:tcW w:type="dxa" w:w="3556"/>
-            <w:shd w:val="clear" w:color="auto" w:fill="FF6633"/>
-            <w:vAlign w:val="center"/>
-            <w:tcMar>
-              <w:top w:w="26" w:type="dxa"/>
-              <w:left w:w="40" w:type="dxa"/>
-              <w:bottom w:w="26" w:type="dxa"/>
-              <w:right w:w="40" w:type="dxa"/>
-            </w:tcMar>
-          </w:tcPr>
-          <w:p>
-            <w:pPr>
-              <w:spacing w:before="0" w:after="0" w:line="190" w:lineRule="exact"/>
-              <w:jc w:val="center"/>
-            </w:pPr>
-            <w:r/>
-            <w:r>
-              <w:rPr>
-                <w:rFonts w:ascii="Arial" w:hAnsi="Arial" w:cs="Arial" w:eastAsia="Arial"/>
-                <w:b/>
-                <w:i w:val="0"/>
-                <w:color w:val="FFFFFF"/>
-                <w:sz w:val="16"/>
-              </w:rPr>
-              <w:t>1 Dec 2026</w:t>
-            </w:r>
-            <w:r>
-              <w:br/>
-            </w:r>
-            <w:r>
-              <w:rPr>
-                <w:rFonts w:ascii="Arial" w:hAnsi="Arial" w:cs="Arial" w:eastAsia="Arial"/>
-                <w:b w:val="0"/>
-                <w:i w:val="0"/>
-                <w:color w:val="FFFFFF"/>
-                <w:sz w:val="16"/>
-              </w:rPr>
-              <w:t>Agreement and Year 1 funding</w:t>
-            </w:r>
-            <w:r>
-              <w:br/>
-            </w:r>
-            <w:r>
-              <w:rPr>
-                <w:rFonts w:ascii="Arial" w:hAnsi="Arial" w:cs="Arial" w:eastAsia="Arial"/>
-                <w:b/>
-                <w:i w:val="0"/>
-                <w:color w:val="FFFFFF"/>
-                <w:sz w:val="16"/>
-              </w:rPr>
-              <w:t>TO CONFIRM</w:t>
-            </w:r>
-          </w:p>
-        </w:tc>
-        <w:tc>
-          <w:tcPr>
-            <w:tcW w:type="dxa" w:w="3556"/>
-            <w:shd w:val="clear" w:color="auto" w:fill="FF6633"/>
-            <w:vAlign w:val="center"/>
-            <w:tcMar>
-              <w:top w:w="26" w:type="dxa"/>
-              <w:left w:w="40" w:type="dxa"/>
-              <w:bottom w:w="26" w:type="dxa"/>
-              <w:right w:w="40" w:type="dxa"/>
-            </w:tcMar>
-          </w:tcPr>
-          <w:p>
-            <w:pPr>
-              <w:spacing w:before="0" w:after="0" w:line="190" w:lineRule="exact"/>
-              <w:jc w:val="center"/>
-            </w:pPr>
-            <w:r/>
-            <w:r>
-              <w:rPr>
-                <w:rFonts w:ascii="Arial" w:hAnsi="Arial" w:cs="Arial" w:eastAsia="Arial"/>
-                <w:b/>
-                <w:i w:val="0"/>
-                <w:color w:val="FFFFFF"/>
-                <w:sz w:val="16"/>
-              </w:rPr>
-              <w:t>Q1 2027</w:t>
-            </w:r>
-            <w:r>
-              <w:br/>
-            </w:r>
-            <w:r>
-              <w:rPr>
-                <w:rFonts w:ascii="Arial" w:hAnsi="Arial" w:cs="Arial" w:eastAsia="Arial"/>
-                <w:b w:val="0"/>
-                <w:i w:val="0"/>
-                <w:color w:val="FFFFFF"/>
-                <w:sz w:val="16"/>
-              </w:rPr>
-              <w:t>Year 1 launch</w:t>
-            </w:r>
-            <w:r>
-              <w:br/>
-            </w:r>
-            <w:r>
-              <w:rPr>
-                <w:rFonts w:ascii="Arial" w:hAnsi="Arial" w:cs="Arial" w:eastAsia="Arial"/>
-                <w:b/>
-                <w:i w:val="0"/>
-                <w:color w:val="FFFFFF"/>
-                <w:sz w:val="16"/>
-              </w:rPr>
-              <w:t>ASSUMPTION / TO CONFIRM</w:t>
-            </w:r>
-          </w:p>
-        </w:tc>
-      </w:tr>
-    </w:tbl>
     <w:tbl>
       <w:tblPr>
         <w:tblW w:type="dxa" w:w="10656"/>
@@ -1749,10 +1458,11 @@
         </w:tblBorders>
       </w:tblPr>
       <w:tblGrid>
-        <w:gridCol w:w="1121"/>
-        <w:gridCol w:w="2804"/>
-        <w:gridCol w:w="3365"/>
-        <w:gridCol w:w="3365"/>
+        <w:gridCol w:w="2131"/>
+        <w:gridCol w:w="2131"/>
+        <w:gridCol w:w="2131"/>
+        <w:gridCol w:w="2131"/>
+        <w:gridCol w:w="2131"/>
       </w:tblGrid>
       <w:tr>
         <w:trPr>
@@ -1760,7 +1470,7 @@
         </w:trPr>
         <w:tc>
           <w:tcPr>
-            <w:tcW w:type="dxa" w:w="1121"/>
+            <w:tcW w:type="dxa" w:w="2131"/>
             <w:shd w:val="clear" w:color="auto" w:fill="1B4332"/>
             <w:vAlign w:val="center"/>
             <w:tcMar>
@@ -1772,7 +1482,7 @@
           </w:tcPr>
           <w:p>
             <w:pPr>
-              <w:spacing w:before="0" w:after="0" w:line="190" w:lineRule="exact"/>
+              <w:spacing w:before="0" w:after="0" w:line="180" w:lineRule="exact"/>
               <w:jc w:val="center"/>
             </w:pPr>
             <w:r/>
@@ -1782,9 +1492,9 @@
                 <w:b/>
                 <w:i w:val="0"/>
                 <w:color w:val="FFFFFF"/>
-                <w:sz w:val="16"/>
+                <w:sz w:val="15"/>
               </w:rPr>
-              <w:t>Ideation</w:t>
+              <w:t>Jan 2027</w:t>
             </w:r>
             <w:r>
               <w:br/>
@@ -1792,172 +1502,18 @@
             <w:r>
               <w:rPr>
                 <w:rFonts w:ascii="Arial" w:hAnsi="Arial" w:cs="Arial" w:eastAsia="Arial"/>
-                <w:b/>
+                <w:b w:val="0"/>
                 <w:i w:val="0"/>
                 <w:color w:val="FFFFFF"/>
-                <w:sz w:val="16"/>
+                <w:sz w:val="15"/>
               </w:rPr>
-              <w:t>4 weeks</w:t>
+              <w:t>Design month</w:t>
             </w:r>
           </w:p>
         </w:tc>
         <w:tc>
           <w:tcPr>
-            <w:tcW w:type="dxa" w:w="2804"/>
-            <w:shd w:val="clear" w:color="auto" w:fill="335D4F"/>
-            <w:vAlign w:val="center"/>
-            <w:tcMar>
-              <w:top w:w="26" w:type="dxa"/>
-              <w:left w:w="40" w:type="dxa"/>
-              <w:bottom w:w="26" w:type="dxa"/>
-              <w:right w:w="40" w:type="dxa"/>
-            </w:tcMar>
-          </w:tcPr>
-          <w:p>
-            <w:pPr>
-              <w:spacing w:before="0" w:after="0" w:line="190" w:lineRule="exact"/>
-              <w:jc w:val="center"/>
-            </w:pPr>
-            <w:r/>
-            <w:r>
-              <w:rPr>
-                <w:rFonts w:ascii="Arial" w:hAnsi="Arial" w:cs="Arial" w:eastAsia="Arial"/>
-                <w:b/>
-                <w:i w:val="0"/>
-                <w:color w:val="FFFFFF"/>
-                <w:sz w:val="16"/>
-              </w:rPr>
-              <w:t>Incubation</w:t>
-            </w:r>
-            <w:r>
-              <w:br/>
-            </w:r>
-            <w:r>
-              <w:rPr>
-                <w:rFonts w:ascii="Arial" w:hAnsi="Arial" w:cs="Arial" w:eastAsia="Arial"/>
-                <w:b/>
-                <w:i w:val="0"/>
-                <w:color w:val="FFFFFF"/>
-                <w:sz w:val="16"/>
-              </w:rPr>
-              <w:t>10 weeks</w:t>
-            </w:r>
-          </w:p>
-        </w:tc>
-        <w:tc>
-          <w:tcPr>
-            <w:tcW w:type="dxa" w:w="3365"/>
-            <w:shd w:val="clear" w:color="auto" w:fill="3E6B58"/>
-            <w:vAlign w:val="center"/>
-            <w:tcMar>
-              <w:top w:w="26" w:type="dxa"/>
-              <w:left w:w="40" w:type="dxa"/>
-              <w:bottom w:w="26" w:type="dxa"/>
-              <w:right w:w="40" w:type="dxa"/>
-            </w:tcMar>
-          </w:tcPr>
-          <w:p>
-            <w:pPr>
-              <w:spacing w:before="0" w:after="0" w:line="190" w:lineRule="exact"/>
-              <w:jc w:val="center"/>
-            </w:pPr>
-            <w:r/>
-            <w:r>
-              <w:rPr>
-                <w:rFonts w:ascii="Arial" w:hAnsi="Arial" w:cs="Arial" w:eastAsia="Arial"/>
-                <w:b/>
-                <w:i w:val="0"/>
-                <w:color w:val="FFFFFF"/>
-                <w:sz w:val="16"/>
-              </w:rPr>
-              <w:t>Acceleration</w:t>
-            </w:r>
-            <w:r>
-              <w:br/>
-            </w:r>
-            <w:r>
-              <w:rPr>
-                <w:rFonts w:ascii="Arial" w:hAnsi="Arial" w:cs="Arial" w:eastAsia="Arial"/>
-                <w:b/>
-                <w:i w:val="0"/>
-                <w:color w:val="FFFFFF"/>
-                <w:sz w:val="16"/>
-              </w:rPr>
-              <w:t>12 weeks</w:t>
-            </w:r>
-          </w:p>
-        </w:tc>
-        <w:tc>
-          <w:tcPr>
-            <w:tcW w:type="dxa" w:w="3365"/>
-            <w:shd w:val="clear" w:color="auto" w:fill="FF6633"/>
-            <w:vAlign w:val="center"/>
-            <w:tcMar>
-              <w:top w:w="26" w:type="dxa"/>
-              <w:left w:w="40" w:type="dxa"/>
-              <w:bottom w:w="26" w:type="dxa"/>
-              <w:right w:w="40" w:type="dxa"/>
-            </w:tcMar>
-          </w:tcPr>
-          <w:p>
-            <w:pPr>
-              <w:spacing w:before="0" w:after="0" w:line="190" w:lineRule="exact"/>
-              <w:jc w:val="center"/>
-            </w:pPr>
-            <w:r/>
-            <w:r>
-              <w:rPr>
-                <w:rFonts w:ascii="Arial" w:hAnsi="Arial" w:cs="Arial" w:eastAsia="Arial"/>
-                <w:b/>
-                <w:i w:val="0"/>
-                <w:color w:val="FFFFFF"/>
-                <w:sz w:val="16"/>
-              </w:rPr>
-              <w:t>Growth</w:t>
-            </w:r>
-            <w:r>
-              <w:br/>
-            </w:r>
-            <w:r>
-              <w:rPr>
-                <w:rFonts w:ascii="Arial" w:hAnsi="Arial" w:cs="Arial" w:eastAsia="Arial"/>
-                <w:b/>
-                <w:i w:val="0"/>
-                <w:color w:val="FFFFFF"/>
-                <w:sz w:val="16"/>
-              </w:rPr>
-              <w:t>12 weeks</w:t>
-            </w:r>
-          </w:p>
-        </w:tc>
-      </w:tr>
-    </w:tbl>
-    <w:tbl>
-      <w:tblPr>
-        <w:tblW w:type="dxa" w:w="10656"/>
-        <w:tblLayout w:type="fixed"/>
-        <w:tblLook w:firstColumn="1" w:firstRow="1" w:lastColumn="0" w:lastRow="0" w:noHBand="0" w:noVBand="1" w:val="04A0"/>
-        <w:tblBorders>
-          <w:top w:val="single" w:sz="4" w:space="0" w:color="335D4F"/>
-          <w:left w:val="single" w:sz="4" w:space="0" w:color="335D4F"/>
-          <w:bottom w:val="single" w:sz="4" w:space="0" w:color="335D4F"/>
-          <w:right w:val="single" w:sz="4" w:space="0" w:color="335D4F"/>
-          <w:insideH w:val="single" w:sz="4" w:space="0" w:color="335D4F"/>
-          <w:insideV w:val="single" w:sz="4" w:space="0" w:color="335D4F"/>
-        </w:tblBorders>
-      </w:tblPr>
-      <w:tblGrid>
-        <w:gridCol w:w="3542"/>
-        <w:gridCol w:w="3556"/>
-        <w:gridCol w:w="3556"/>
-      </w:tblGrid>
-      <w:tr>
-        <w:trPr>
-          <w:cantSplit/>
-        </w:trPr>
-        <w:tc>
-          <w:tcPr>
-            <w:tcW w:type="dxa" w:w="3542"/>
+            <w:tcW w:type="dxa" w:w="2131"/>
             <w:shd w:val="clear" w:color="auto" w:fill="335D4F"/>
             <w:vAlign w:val="center"/>
             <w:tcMar>
@@ -1981,7 +1537,7 @@
                 <w:color w:val="FFFFFF"/>
                 <w:sz w:val="15"/>
               </w:rPr>
-              <w:t>Sept 2027</w:t>
+              <w:t>Feb 2027</w:t>
             </w:r>
             <w:r>
               <w:br/>
@@ -1994,7 +1550,20 @@
                 <w:color w:val="FFFFFF"/>
                 <w:sz w:val="15"/>
               </w:rPr>
-              <w:t>UNGA82 and Climate Week NYC</w:t>
+              <w:t>On-site training</w:t>
+            </w:r>
+            <w:r>
+              <w:br/>
+            </w:r>
+            <w:r>
+              <w:rPr>
+                <w:rFonts w:ascii="Arial" w:hAnsi="Arial" w:cs="Arial" w:eastAsia="Arial"/>
+                <w:b w:val="0"/>
+                <w:i w:val="0"/>
+                <w:color w:val="FFFFFF"/>
+                <w:sz w:val="15"/>
+              </w:rPr>
+              <w:t>Ideation, 4 weeks</w:t>
             </w:r>
             <w:r>
               <w:br/>
@@ -2007,13 +1576,125 @@
                 <w:color w:val="FFFFFF"/>
                 <w:sz w:val="15"/>
               </w:rPr>
-              <w:t>Team slots TO CONFIRM</w:t>
+              <w:t>Assumption</w:t>
             </w:r>
           </w:p>
         </w:tc>
         <w:tc>
           <w:tcPr>
-            <w:tcW w:type="dxa" w:w="3556"/>
+            <w:tcW w:type="dxa" w:w="2131"/>
+            <w:shd w:val="clear" w:color="auto" w:fill="335D4F"/>
+            <w:vAlign w:val="center"/>
+            <w:tcMar>
+              <w:top w:w="26" w:type="dxa"/>
+              <w:left w:w="40" w:type="dxa"/>
+              <w:bottom w:w="26" w:type="dxa"/>
+              <w:right w:w="40" w:type="dxa"/>
+            </w:tcMar>
+          </w:tcPr>
+          <w:p>
+            <w:pPr>
+              <w:spacing w:before="0" w:after="0" w:line="180" w:lineRule="exact"/>
+              <w:jc w:val="center"/>
+            </w:pPr>
+            <w:r/>
+            <w:r>
+              <w:rPr>
+                <w:rFonts w:ascii="Arial" w:hAnsi="Arial" w:cs="Arial" w:eastAsia="Arial"/>
+                <w:b/>
+                <w:i w:val="0"/>
+                <w:color w:val="FFFFFF"/>
+                <w:sz w:val="15"/>
+              </w:rPr>
+              <w:t>Mar 2027</w:t>
+            </w:r>
+            <w:r>
+              <w:br/>
+            </w:r>
+            <w:r>
+              <w:rPr>
+                <w:rFonts w:ascii="Arial" w:hAnsi="Arial" w:cs="Arial" w:eastAsia="Arial"/>
+                <w:b w:val="0"/>
+                <w:i w:val="0"/>
+                <w:color w:val="FFFFFF"/>
+                <w:sz w:val="15"/>
+              </w:rPr>
+              <w:t>Incubation starts</w:t>
+            </w:r>
+            <w:r>
+              <w:br/>
+            </w:r>
+            <w:r>
+              <w:rPr>
+                <w:rFonts w:ascii="Arial" w:hAnsi="Arial" w:cs="Arial" w:eastAsia="Arial"/>
+                <w:b w:val="0"/>
+                <w:i w:val="0"/>
+                <w:color w:val="FFFFFF"/>
+                <w:sz w:val="15"/>
+              </w:rPr>
+              <w:t>10 weeks</w:t>
+            </w:r>
+          </w:p>
+        </w:tc>
+        <w:tc>
+          <w:tcPr>
+            <w:tcW w:type="dxa" w:w="2131"/>
+            <w:shd w:val="clear" w:color="auto" w:fill="3E6B58"/>
+            <w:vAlign w:val="center"/>
+            <w:tcMar>
+              <w:top w:w="26" w:type="dxa"/>
+              <w:left w:w="40" w:type="dxa"/>
+              <w:bottom w:w="26" w:type="dxa"/>
+              <w:right w:w="40" w:type="dxa"/>
+            </w:tcMar>
+          </w:tcPr>
+          <w:p>
+            <w:pPr>
+              <w:spacing w:before="0" w:after="0" w:line="180" w:lineRule="exact"/>
+              <w:jc w:val="center"/>
+            </w:pPr>
+            <w:r/>
+            <w:r>
+              <w:rPr>
+                <w:rFonts w:ascii="Arial" w:hAnsi="Arial" w:cs="Arial" w:eastAsia="Arial"/>
+                <w:b/>
+                <w:i w:val="0"/>
+                <w:color w:val="FFFFFF"/>
+                <w:sz w:val="15"/>
+              </w:rPr>
+              <w:t>Then</w:t>
+            </w:r>
+            <w:r>
+              <w:br/>
+            </w:r>
+            <w:r>
+              <w:rPr>
+                <w:rFonts w:ascii="Arial" w:hAnsi="Arial" w:cs="Arial" w:eastAsia="Arial"/>
+                <w:b w:val="0"/>
+                <w:i w:val="0"/>
+                <w:color w:val="FFFFFF"/>
+                <w:sz w:val="15"/>
+              </w:rPr>
+              <w:t>Acceleration</w:t>
+            </w:r>
+            <w:r>
+              <w:br/>
+            </w:r>
+            <w:r>
+              <w:rPr>
+                <w:rFonts w:ascii="Arial" w:hAnsi="Arial" w:cs="Arial" w:eastAsia="Arial"/>
+                <w:b w:val="0"/>
+                <w:i w:val="0"/>
+                <w:color w:val="FFFFFF"/>
+                <w:sz w:val="15"/>
+              </w:rPr>
+              <w:t>12 weeks</w:t>
+            </w:r>
+          </w:p>
+        </w:tc>
+        <w:tc>
+          <w:tcPr>
+            <w:tcW w:type="dxa" w:w="2131"/>
             <w:shd w:val="clear" w:color="auto" w:fill="FF6633"/>
             <w:vAlign w:val="center"/>
             <w:tcMar>
@@ -2025,7 +1706,7 @@
           </w:tcPr>
           <w:p>
             <w:pPr>
-              <w:spacing w:before="0" w:after="0" w:line="190" w:lineRule="exact"/>
+              <w:spacing w:before="0" w:after="0" w:line="180" w:lineRule="exact"/>
               <w:jc w:val="center"/>
             </w:pPr>
             <w:r/>
@@ -2035,7 +1716,271 @@
                 <w:b/>
                 <w:i w:val="0"/>
                 <w:color w:val="FFFFFF"/>
-                <w:sz w:val="16"/>
+                <w:sz w:val="15"/>
+              </w:rPr>
+              <w:t>Then</w:t>
+            </w:r>
+            <w:r>
+              <w:br/>
+            </w:r>
+            <w:r>
+              <w:rPr>
+                <w:rFonts w:ascii="Arial" w:hAnsi="Arial" w:cs="Arial" w:eastAsia="Arial"/>
+                <w:b w:val="0"/>
+                <w:i w:val="0"/>
+                <w:color w:val="FFFFFF"/>
+                <w:sz w:val="15"/>
+              </w:rPr>
+              <w:t>Growth</w:t>
+            </w:r>
+            <w:r>
+              <w:br/>
+            </w:r>
+            <w:r>
+              <w:rPr>
+                <w:rFonts w:ascii="Arial" w:hAnsi="Arial" w:cs="Arial" w:eastAsia="Arial"/>
+                <w:b w:val="0"/>
+                <w:i w:val="0"/>
+                <w:color w:val="FFFFFF"/>
+                <w:sz w:val="15"/>
+              </w:rPr>
+              <w:t>12 weeks</w:t>
+            </w:r>
+          </w:p>
+        </w:tc>
+      </w:tr>
+    </w:tbl>
+    <w:tbl>
+      <w:tblPr>
+        <w:tblW w:type="dxa" w:w="10656"/>
+        <w:tblLayout w:type="fixed"/>
+        <w:tblLook w:firstColumn="1" w:firstRow="1" w:lastColumn="0" w:lastRow="0" w:noHBand="0" w:noVBand="1" w:val="04A0"/>
+        <w:tblBorders>
+          <w:top w:val="single" w:sz="4" w:space="0" w:color="335D4F"/>
+          <w:left w:val="single" w:sz="4" w:space="0" w:color="335D4F"/>
+          <w:bottom w:val="single" w:sz="4" w:space="0" w:color="335D4F"/>
+          <w:right w:val="single" w:sz="4" w:space="0" w:color="335D4F"/>
+          <w:insideH w:val="single" w:sz="4" w:space="0" w:color="335D4F"/>
+          <w:insideV w:val="single" w:sz="4" w:space="0" w:color="335D4F"/>
+        </w:tblBorders>
+      </w:tblPr>
+      <w:tblGrid>
+        <w:gridCol w:w="2131"/>
+        <w:gridCol w:w="2131"/>
+        <w:gridCol w:w="2131"/>
+        <w:gridCol w:w="2131"/>
+        <w:gridCol w:w="2131"/>
+      </w:tblGrid>
+      <w:tr>
+        <w:trPr>
+          <w:cantSplit/>
+        </w:trPr>
+        <w:tc>
+          <w:tcPr>
+            <w:tcW w:type="dxa" w:w="2131"/>
+            <w:shd w:val="clear" w:color="auto" w:fill="335D4F"/>
+            <w:vAlign w:val="center"/>
+            <w:tcMar>
+              <w:top w:w="26" w:type="dxa"/>
+              <w:left w:w="40" w:type="dxa"/>
+              <w:bottom w:w="26" w:type="dxa"/>
+              <w:right w:w="40" w:type="dxa"/>
+            </w:tcMar>
+          </w:tcPr>
+          <w:p>
+            <w:pPr>
+              <w:spacing w:before="0" w:after="0" w:line="180" w:lineRule="exact"/>
+              <w:jc w:val="center"/>
+            </w:pPr>
+            <w:r/>
+            <w:r>
+              <w:rPr>
+                <w:rFonts w:ascii="Arial" w:hAnsi="Arial" w:cs="Arial" w:eastAsia="Arial"/>
+                <w:b/>
+                <w:i w:val="0"/>
+                <w:color w:val="FFFFFF"/>
+                <w:sz w:val="15"/>
+              </w:rPr>
+              <w:t>21 Oct 2026</w:t>
+            </w:r>
+            <w:r>
+              <w:br/>
+            </w:r>
+            <w:r>
+              <w:rPr>
+                <w:rFonts w:ascii="Arial" w:hAnsi="Arial" w:cs="Arial" w:eastAsia="Arial"/>
+                <w:b w:val="0"/>
+                <w:i w:val="0"/>
+                <w:color w:val="FFFFFF"/>
+                <w:sz w:val="15"/>
+              </w:rPr>
+              <w:t>Meeting with Pav</w:t>
+            </w:r>
+          </w:p>
+        </w:tc>
+        <w:tc>
+          <w:tcPr>
+            <w:tcW w:type="dxa" w:w="2131"/>
+            <w:shd w:val="clear" w:color="auto" w:fill="FF6633"/>
+            <w:vAlign w:val="center"/>
+            <w:tcMar>
+              <w:top w:w="26" w:type="dxa"/>
+              <w:left w:w="40" w:type="dxa"/>
+              <w:bottom w:w="26" w:type="dxa"/>
+              <w:right w:w="40" w:type="dxa"/>
+            </w:tcMar>
+          </w:tcPr>
+          <w:p>
+            <w:pPr>
+              <w:spacing w:before="0" w:after="0" w:line="170" w:lineRule="exact"/>
+              <w:jc w:val="center"/>
+            </w:pPr>
+            <w:r/>
+            <w:r>
+              <w:rPr>
+                <w:rFonts w:ascii="Arial" w:hAnsi="Arial" w:cs="Arial" w:eastAsia="Arial"/>
+                <w:b/>
+                <w:i w:val="0"/>
+                <w:color w:val="FFFFFF"/>
+                <w:sz w:val="14"/>
+              </w:rPr>
+              <w:t>1 Dec 2026</w:t>
+            </w:r>
+            <w:r>
+              <w:br/>
+            </w:r>
+            <w:r>
+              <w:rPr>
+                <w:rFonts w:ascii="Arial" w:hAnsi="Arial" w:cs="Arial" w:eastAsia="Arial"/>
+                <w:b w:val="0"/>
+                <w:i w:val="0"/>
+                <w:color w:val="FFFFFF"/>
+                <w:sz w:val="14"/>
+              </w:rPr>
+              <w:t>Agreement and</w:t>
+            </w:r>
+            <w:r>
+              <w:br/>
+            </w:r>
+            <w:r>
+              <w:rPr>
+                <w:rFonts w:ascii="Arial" w:hAnsi="Arial" w:cs="Arial" w:eastAsia="Arial"/>
+                <w:b w:val="0"/>
+                <w:i w:val="0"/>
+                <w:color w:val="FFFFFF"/>
+                <w:sz w:val="14"/>
+              </w:rPr>
+              <w:t>Year 1 funding</w:t>
+            </w:r>
+            <w:r>
+              <w:br/>
+            </w:r>
+            <w:r>
+              <w:rPr>
+                <w:rFonts w:ascii="Arial" w:hAnsi="Arial" w:cs="Arial" w:eastAsia="Arial"/>
+                <w:b/>
+                <w:i w:val="0"/>
+                <w:color w:val="FFFFFF"/>
+                <w:sz w:val="14"/>
+              </w:rPr>
+              <w:t>TO CONFIRM</w:t>
+            </w:r>
+          </w:p>
+        </w:tc>
+        <w:tc>
+          <w:tcPr>
+            <w:tcW w:type="dxa" w:w="2131"/>
+            <w:shd w:val="clear" w:color="auto" w:fill="335D4F"/>
+            <w:vAlign w:val="center"/>
+            <w:tcMar>
+              <w:top w:w="26" w:type="dxa"/>
+              <w:left w:w="40" w:type="dxa"/>
+              <w:bottom w:w="26" w:type="dxa"/>
+              <w:right w:w="40" w:type="dxa"/>
+            </w:tcMar>
+          </w:tcPr>
+          <w:p>
+            <w:pPr>
+              <w:spacing w:before="0" w:after="0" w:line="170" w:lineRule="exact"/>
+              <w:jc w:val="center"/>
+            </w:pPr>
+            <w:r/>
+            <w:r>
+              <w:rPr>
+                <w:rFonts w:ascii="Arial" w:hAnsi="Arial" w:cs="Arial" w:eastAsia="Arial"/>
+                <w:b/>
+                <w:i w:val="0"/>
+                <w:color w:val="FFFFFF"/>
+                <w:sz w:val="14"/>
+              </w:rPr>
+              <w:t>Sept 2027</w:t>
+            </w:r>
+            <w:r>
+              <w:br/>
+            </w:r>
+            <w:r>
+              <w:rPr>
+                <w:rFonts w:ascii="Arial" w:hAnsi="Arial" w:cs="Arial" w:eastAsia="Arial"/>
+                <w:b w:val="0"/>
+                <w:i w:val="0"/>
+                <w:color w:val="FFFFFF"/>
+                <w:sz w:val="14"/>
+              </w:rPr>
+              <w:t>UNGA82 and</w:t>
+            </w:r>
+            <w:r>
+              <w:br/>
+            </w:r>
+            <w:r>
+              <w:rPr>
+                <w:rFonts w:ascii="Arial" w:hAnsi="Arial" w:cs="Arial" w:eastAsia="Arial"/>
+                <w:b w:val="0"/>
+                <w:i w:val="0"/>
+                <w:color w:val="FFFFFF"/>
+                <w:sz w:val="14"/>
+              </w:rPr>
+              <w:t>Climate Week NYC</w:t>
+            </w:r>
+            <w:r>
+              <w:br/>
+            </w:r>
+            <w:r>
+              <w:rPr>
+                <w:rFonts w:ascii="Arial" w:hAnsi="Arial" w:cs="Arial" w:eastAsia="Arial"/>
+                <w:b/>
+                <w:i w:val="0"/>
+                <w:color w:val="FFFFFF"/>
+                <w:sz w:val="14"/>
+              </w:rPr>
+              <w:t>Team slots TO CONFIRM</w:t>
+            </w:r>
+          </w:p>
+        </w:tc>
+        <w:tc>
+          <w:tcPr>
+            <w:tcW w:type="dxa" w:w="2131"/>
+            <w:shd w:val="clear" w:color="auto" w:fill="FF6633"/>
+            <w:vAlign w:val="center"/>
+            <w:tcMar>
+              <w:top w:w="26" w:type="dxa"/>
+              <w:left w:w="40" w:type="dxa"/>
+              <w:bottom w:w="26" w:type="dxa"/>
+              <w:right w:w="40" w:type="dxa"/>
+            </w:tcMar>
+          </w:tcPr>
+          <w:p>
+            <w:pPr>
+              <w:spacing w:before="0" w:after="0" w:line="180" w:lineRule="exact"/>
+              <w:jc w:val="center"/>
+            </w:pPr>
+            <w:r/>
+            <w:r>
+              <w:rPr>
+                <w:rFonts w:ascii="Arial" w:hAnsi="Arial" w:cs="Arial" w:eastAsia="Arial"/>
+                <w:b/>
+                <w:i w:val="0"/>
+                <w:color w:val="FFFFFF"/>
+                <w:sz w:val="15"/>
               </w:rPr>
               <w:t>2028</w:t>
             </w:r>
@@ -2048,9 +1993,22 @@
                 <w:b w:val="0"/>
                 <w:i w:val="0"/>
                 <w:color w:val="FFFFFF"/>
-                <w:sz w:val="16"/>
+                <w:sz w:val="15"/>
               </w:rPr>
-              <w:t>Year 2, US$75,000</w:t>
+              <w:t>Year 2</w:t>
+            </w:r>
+            <w:r>
+              <w:br/>
+            </w:r>
+            <w:r>
+              <w:rPr>
+                <w:rFonts w:ascii="Arial" w:hAnsi="Arial" w:cs="Arial" w:eastAsia="Arial"/>
+                <w:b w:val="0"/>
+                <w:i w:val="0"/>
+                <w:color w:val="FFFFFF"/>
+                <w:sz w:val="15"/>
+              </w:rPr>
+              <w:t>US$75,000</w:t>
             </w:r>
             <w:r>
               <w:br/>
@@ -2061,7 +2019,7 @@
                 <w:b/>
                 <w:i w:val="0"/>
                 <w:color w:val="FFFFFF"/>
-                <w:sz w:val="16"/>
+                <w:sz w:val="15"/>
               </w:rPr>
               <w:t>TO CONFIRM</w:t>
             </w:r>
@@ -2069,7 +2027,7 @@
         </w:tc>
         <w:tc>
           <w:tcPr>
-            <w:tcW w:type="dxa" w:w="3556"/>
+            <w:tcW w:type="dxa" w:w="2131"/>
             <w:shd w:val="clear" w:color="auto" w:fill="FF6633"/>
             <w:vAlign w:val="center"/>
             <w:tcMar>
@@ -2081,7 +2039,7 @@
           </w:tcPr>
           <w:p>
             <w:pPr>
-              <w:spacing w:before="0" w:after="0" w:line="190" w:lineRule="exact"/>
+              <w:spacing w:before="0" w:after="0" w:line="180" w:lineRule="exact"/>
               <w:jc w:val="center"/>
             </w:pPr>
             <w:r/>
@@ -2091,7 +2049,7 @@
                 <w:b/>
                 <w:i w:val="0"/>
                 <w:color w:val="FFFFFF"/>
-                <w:sz w:val="16"/>
+                <w:sz w:val="15"/>
               </w:rPr>
               <w:t>2029</w:t>
             </w:r>
@@ -2104,9 +2062,22 @@
                 <w:b w:val="0"/>
                 <w:i w:val="0"/>
                 <w:color w:val="FFFFFF"/>
-                <w:sz w:val="16"/>
+                <w:sz w:val="15"/>
               </w:rPr>
-              <w:t>Year 3, US$50,000</w:t>
+              <w:t>Year 3</w:t>
+            </w:r>
+            <w:r>
+              <w:br/>
+            </w:r>
+            <w:r>
+              <w:rPr>
+                <w:rFonts w:ascii="Arial" w:hAnsi="Arial" w:cs="Arial" w:eastAsia="Arial"/>
+                <w:b w:val="0"/>
+                <w:i w:val="0"/>
+                <w:color w:val="FFFFFF"/>
+                <w:sz w:val="15"/>
+              </w:rPr>
+              <w:t>US$50,000</w:t>
             </w:r>
             <w:r>
               <w:br/>
@@ -2117,7 +2088,7 @@
                 <w:b/>
                 <w:i w:val="0"/>
                 <w:color w:val="FFFFFF"/>
-                <w:sz w:val="16"/>
+                <w:sz w:val="15"/>
               </w:rPr>
               <w:t>TO CONFIRM</w:t>
             </w:r>
@@ -2137,7 +2108,7 @@
           <w:color w:val="222A27"/>
           <w:sz w:val="17"/>
         </w:rPr>
-        <w:t>UNGA82 opens 7 September 2027. The general debate opens 21 September 2027 (UN schedule). Climate Week NYC is the same month. Exact Climate Week dates are TO CONFIRM. The REIN plan is an SDG Media Zone slot for 2 incubation winners and 2 growth teams. That slot is TO CONFIRM. Stage weeks are not pinned to calendar dates until the launch is agreed.</w:t>
+        <w:t>UNGA82 opens 7 September 2027. The general debate opens 21 September 2027 (UN schedule). Climate Week NYC is the same month. Exact Climate Week dates are TO CONFIRM. The REIN plan is an SDG Media Zone slot for 2 incubation winners and 2 growth teams. That slot is TO CONFIRM.</w:t>
       </w:r>
     </w:p>
     <w:p>
@@ -2153,7 +2124,7 @@
           <w:color w:val="335D4F"/>
           <w:sz w:val="24"/>
         </w:rPr>
-        <w:t>5. Top 5 donors in Ghana</w:t>
+        <w:t>4. Top 5 donors in Ghana</w:t>
       </w:r>
     </w:p>
     <w:p>

</xml_diff>

<commit_message>
Replace the donor shortlist with a 2026-2030 program table.
Six sourced programs, a pointer to the full scan, and a one-line route for Laurence.

Co-authored-by: gideonblaauw-creator <gideonblaauw-creator@users.noreply.github.com>
</commit_message>
<xml_diff>
--- a/archive/rein-hubs/2026-10-20-laurence-ghana-onepager.docx
+++ b/archive/rein-hubs/2026-10-20-laurence-ghana-onepager.docx
@@ -2114,7 +2114,7 @@
     <w:p>
       <w:pPr>
         <w:keepNext/>
-        <w:spacing w:before="80" w:after="20" w:line="280" w:lineRule="exact"/>
+        <w:spacing w:before="60" w:after="20" w:line="280" w:lineRule="exact"/>
       </w:pPr>
       <w:r>
         <w:rPr>
@@ -2124,22 +2124,7 @@
           <w:color w:val="335D4F"/>
           <w:sz w:val="24"/>
         </w:rPr>
-        <w:t>4. Top 5 donors in Ghana</w:t>
-      </w:r>
-    </w:p>
-    <w:p>
-      <w:pPr>
-        <w:spacing w:before="0" w:after="40" w:line="210" w:lineRule="exact"/>
-      </w:pPr>
-      <w:r>
-        <w:rPr>
-          <w:rFonts w:ascii="Georgia" w:hAnsi="Georgia" w:cs="Georgia" w:eastAsia="Georgia"/>
-          <w:b w:val="0"/>
-          <w:i w:val="0"/>
-          <w:color w:val="222A27"/>
-          <w:sz w:val="17"/>
-        </w:rPr>
-        <w:t>Ranked for a university-hosted climate-startup hub that needs a multi-year grant of US$500,000 to US$1 million. Ticket sizes are copied from the public source. Anything not in that source is marked UNVERIFIED.</w:t>
+        <w:t>4. Donor programs in Ghana, 2026-2030</w:t>
       </w:r>
     </w:p>
     <w:tbl>
@@ -2157,11 +2142,10 @@
         </w:tblBorders>
       </w:tblPr>
       <w:tblGrid>
-        <w:gridCol w:w="1655"/>
+        <w:gridCol w:w="3096"/>
         <w:gridCol w:w="2232"/>
-        <w:gridCol w:w="2448"/>
-        <w:gridCol w:w="2448"/>
-        <w:gridCol w:w="1872"/>
+        <w:gridCol w:w="2664"/>
+        <w:gridCol w:w="2664"/>
       </w:tblGrid>
       <w:tr>
         <w:trPr>
@@ -2169,7 +2153,7 @@
         </w:trPr>
         <w:tc>
           <w:tcPr>
-            <w:tcW w:type="dxa" w:w="1655"/>
+            <w:tcW w:type="dxa" w:w="3096"/>
             <w:shd w:val="clear" w:color="auto" w:fill="335D4F"/>
             <w:vAlign w:val="center"/>
             <w:tcMar>
@@ -2192,7 +2176,7 @@
                 <w:color w:val="FFFFFF"/>
                 <w:sz w:val="14"/>
               </w:rPr>
-              <w:t>Donor</w:t>
+              <w:t>Donor / program</w:t>
             </w:r>
           </w:p>
         </w:tc>
@@ -2221,13 +2205,13 @@
                 <w:color w:val="FFFFFF"/>
                 <w:sz w:val="14"/>
               </w:rPr>
-              <w:t>Programme</w:t>
+              <w:t>Period</w:t>
             </w:r>
           </w:p>
         </w:tc>
         <w:tc>
           <w:tcPr>
-            <w:tcW w:type="dxa" w:w="2448"/>
+            <w:tcW w:type="dxa" w:w="2664"/>
             <w:shd w:val="clear" w:color="auto" w:fill="335D4F"/>
             <w:vAlign w:val="center"/>
             <w:tcMar>
@@ -2250,13 +2234,13 @@
                 <w:color w:val="FFFFFF"/>
                 <w:sz w:val="14"/>
               </w:rPr>
-              <w:t>Ticket, sourced</w:t>
+              <w:t>Size</w:t>
             </w:r>
           </w:p>
         </w:tc>
         <w:tc>
           <w:tcPr>
-            <w:tcW w:type="dxa" w:w="2448"/>
+            <w:tcW w:type="dxa" w:w="2664"/>
             <w:shd w:val="clear" w:color="auto" w:fill="335D4F"/>
             <w:vAlign w:val="center"/>
             <w:tcMar>
@@ -2279,36 +2263,7 @@
                 <w:color w:val="FFFFFF"/>
                 <w:sz w:val="14"/>
               </w:rPr>
-              <w:t>Why it fits</w:t>
-            </w:r>
-          </w:p>
-        </w:tc>
-        <w:tc>
-          <w:tcPr>
-            <w:tcW w:type="dxa" w:w="1872"/>
-            <w:shd w:val="clear" w:color="auto" w:fill="335D4F"/>
-            <w:vAlign w:val="center"/>
-            <w:tcMar>
-              <w:top w:w="30" w:type="dxa"/>
-              <w:left w:w="70" w:type="dxa"/>
-              <w:bottom w:w="30" w:type="dxa"/>
-              <w:right w:w="70" w:type="dxa"/>
-            </w:tcMar>
-          </w:tcPr>
-          <w:p>
-            <w:pPr>
-              <w:spacing w:before="0" w:after="0" w:line="180" w:lineRule="exact"/>
-            </w:pPr>
-            <w:r/>
-            <w:r>
-              <w:rPr>
-                <w:rFonts w:ascii="Arial" w:hAnsi="Arial" w:cs="Arial" w:eastAsia="Arial"/>
-                <w:b/>
-                <w:i w:val="0"/>
-                <w:color w:val="FFFFFF"/>
-                <w:sz w:val="14"/>
-              </w:rPr>
-              <w:t>Source</w:t>
+              <w:t>Fit for REIN</w:t>
             </w:r>
           </w:p>
         </w:tc>
@@ -2319,7 +2274,7 @@
         </w:trPr>
         <w:tc>
           <w:tcPr>
-            <w:tcW w:type="dxa" w:w="1655"/>
+            <w:tcW w:type="dxa" w:w="3096"/>
             <w:vAlign w:val="center"/>
             <w:tcMar>
               <w:top w:w="30" w:type="dxa"/>
@@ -2341,7 +2296,7 @@
                 <w:color w:val="222A27"/>
                 <w:sz w:val="13"/>
               </w:rPr>
-              <w:t>1. GIZ / BMZ</w:t>
+              <w:t>Danida Green Business Partnerships (1)</w:t>
             </w:r>
           </w:p>
         </w:tc>
@@ -2369,13 +2324,13 @@
                 <w:color w:val="222A27"/>
                 <w:sz w:val="13"/>
               </w:rPr>
-              <w:t>PFS programme with GCIC at Ashesi University. Green incubation and acceleration.</w:t>
+              <w:t>3 to 5 years. 2025 round closed.</w:t>
             </w:r>
           </w:p>
         </w:tc>
         <w:tc>
           <w:tcPr>
-            <w:tcW w:type="dxa" w:w="2448"/>
+            <w:tcW w:type="dxa" w:w="2664"/>
             <w:vAlign w:val="center"/>
             <w:tcMar>
               <w:top w:w="30" w:type="dxa"/>
@@ -2397,13 +2352,13 @@
                 <w:color w:val="222A27"/>
                 <w:sz w:val="13"/>
               </w:rPr>
-              <w:t>About EUR 1.2 million for the 2024 partnership. Each business can get up to EUR 10,000. Not a US dollar figure.</w:t>
+              <w:t>DKK 4 million to 15 million</w:t>
             </w:r>
           </w:p>
         </w:tc>
         <w:tc>
           <w:tcPr>
-            <w:tcW w:type="dxa" w:w="2448"/>
+            <w:tcW w:type="dxa" w:w="2664"/>
             <w:vAlign w:val="center"/>
             <w:tcMar>
               <w:top w:w="30" w:type="dxa"/>
@@ -2425,35 +2380,7 @@
                 <w:color w:val="222A27"/>
                 <w:sz w:val="13"/>
               </w:rPr>
-              <w:t>Closest public match: a Ghana university climate incubator, at a size that covers this ask.</w:t>
-            </w:r>
-          </w:p>
-        </w:tc>
-        <w:tc>
-          <w:tcPr>
-            <w:tcW w:type="dxa" w:w="1872"/>
-            <w:vAlign w:val="center"/>
-            <w:tcMar>
-              <w:top w:w="30" w:type="dxa"/>
-              <w:left w:w="70" w:type="dxa"/>
-              <w:bottom w:w="30" w:type="dxa"/>
-              <w:right w:w="70" w:type="dxa"/>
-            </w:tcMar>
-          </w:tcPr>
-          <w:p>
-            <w:pPr>
-              <w:spacing w:before="0" w:after="0" w:line="170" w:lineRule="exact"/>
-            </w:pPr>
-            <w:r/>
-            <w:r>
-              <w:rPr>
-                <w:rFonts w:ascii="Arial" w:hAnsi="Arial" w:cs="Arial" w:eastAsia="Arial"/>
-                <w:b w:val="0"/>
-                <w:i w:val="0"/>
-                <w:color w:val="222A27"/>
-                <w:sz w:val="13"/>
-              </w:rPr>
-              <w:t>https://ghanacic.ashesi.edu.gh/giz-partners-with-ashesis-gcic-towards-green-entrepreneurship-development/</w:t>
+              <w:t>Climate adaptation. Ghana eligible. A university cannot administer.</w:t>
             </w:r>
           </w:p>
         </w:tc>
@@ -2464,7 +2391,7 @@
         </w:trPr>
         <w:tc>
           <w:tcPr>
-            <w:tcW w:type="dxa" w:w="1655"/>
+            <w:tcW w:type="dxa" w:w="3096"/>
             <w:vAlign w:val="center"/>
             <w:tcMar>
               <w:top w:w="30" w:type="dxa"/>
@@ -2486,7 +2413,7 @@
                 <w:color w:val="222A27"/>
                 <w:sz w:val="13"/>
               </w:rPr>
-              <w:t>2. Global Affairs Canada</w:t>
+              <w:t>GIZ / BMZ, GCIC at Ashesi (2)</w:t>
             </w:r>
           </w:p>
         </w:tc>
@@ -2514,13 +2441,13 @@
                 <w:color w:val="222A27"/>
                 <w:sz w:val="13"/>
               </w:rPr>
-              <w:t>Supporting the Green Economy of Ghana, through GCIC at Ashesi University.</w:t>
+              <w:t>PFS ends Dec 2025. Renewal UNVERIFIED.</w:t>
             </w:r>
           </w:p>
         </w:tc>
         <w:tc>
           <w:tcPr>
-            <w:tcW w:type="dxa" w:w="2448"/>
+            <w:tcW w:type="dxa" w:w="2664"/>
             <w:vAlign w:val="center"/>
             <w:tcMar>
               <w:top w:w="30" w:type="dxa"/>
@@ -2542,13 +2469,13 @@
                 <w:color w:val="222A27"/>
                 <w:sz w:val="13"/>
               </w:rPr>
-              <w:t>Maximum contribution $10,000,000 on the Canada project browser (Canadian dollars), 23 Aug 2021 to 31 Mar 2026. Larger than this ask. A follow-on is UNVERIFIED.</w:t>
+              <w:t>About EUR 1.2 million</w:t>
             </w:r>
           </w:p>
         </w:tc>
         <w:tc>
           <w:tcPr>
-            <w:tcW w:type="dxa" w:w="2448"/>
+            <w:tcW w:type="dxa" w:w="2664"/>
             <w:vAlign w:val="center"/>
             <w:tcMar>
               <w:top w:w="30" w:type="dxa"/>
@@ -2570,35 +2497,7 @@
                 <w:color w:val="222A27"/>
                 <w:sz w:val="13"/>
               </w:rPr>
-              <w:t>Published multi-year grant to a Ghanaian university for climate entrepreneurship.</w:t>
-            </w:r>
-          </w:p>
-        </w:tc>
-        <w:tc>
-          <w:tcPr>
-            <w:tcW w:type="dxa" w:w="1872"/>
-            <w:vAlign w:val="center"/>
-            <w:tcMar>
-              <w:top w:w="30" w:type="dxa"/>
-              <w:left w:w="70" w:type="dxa"/>
-              <w:bottom w:w="30" w:type="dxa"/>
-              <w:right w:w="70" w:type="dxa"/>
-            </w:tcMar>
-          </w:tcPr>
-          <w:p>
-            <w:pPr>
-              <w:spacing w:before="0" w:after="0" w:line="170" w:lineRule="exact"/>
-            </w:pPr>
-            <w:r/>
-            <w:r>
-              <w:rPr>
-                <w:rFonts w:ascii="Arial" w:hAnsi="Arial" w:cs="Arial" w:eastAsia="Arial"/>
-                <w:b w:val="0"/>
-                <w:i w:val="0"/>
-                <w:color w:val="222A27"/>
-                <w:sz w:val="13"/>
-              </w:rPr>
-              <w:t>https://w05.international.gc.ca/projectbrowser-banqueprojets/project-projet/details/p008970001</w:t>
+              <w:t>Closest university climate incubator.</w:t>
             </w:r>
           </w:p>
         </w:tc>
@@ -2609,7 +2508,7 @@
         </w:trPr>
         <w:tc>
           <w:tcPr>
-            <w:tcW w:type="dxa" w:w="1655"/>
+            <w:tcW w:type="dxa" w:w="3096"/>
             <w:vAlign w:val="center"/>
             <w:tcMar>
               <w:top w:w="30" w:type="dxa"/>
@@ -2631,7 +2530,7 @@
                 <w:color w:val="222A27"/>
                 <w:sz w:val="13"/>
               </w:rPr>
-              <w:t>3. AfDB, YEI MDTF and FAPA</w:t>
+              <w:t>AfDB MicroGREEN (3)</w:t>
             </w:r>
           </w:p>
         </w:tc>
@@ -2659,13 +2558,13 @@
                 <w:color w:val="222A27"/>
                 <w:sz w:val="13"/>
               </w:rPr>
-              <w:t>MicroGREEN. Green jobs for youth and women in Ghana and Senegal. Implementer: Invest in Africa.</w:t>
+              <w:t>From Mar 2024. End past 2026 UNVERIFIED.</w:t>
             </w:r>
           </w:p>
         </w:tc>
         <w:tc>
           <w:tcPr>
-            <w:tcW w:type="dxa" w:w="2448"/>
+            <w:tcW w:type="dxa" w:w="2664"/>
             <w:vAlign w:val="center"/>
             <w:tcMar>
               <w:top w:w="30" w:type="dxa"/>
@@ -2687,13 +2586,13 @@
                 <w:color w:val="222A27"/>
                 <w:sz w:val="13"/>
               </w:rPr>
-              <w:t>US$850,000 FAPA grant (11 Aug 2025), plus an initial US$1 million YEI MDTF commitment. Ghana and Senegal share the project.</w:t>
+              <w:t>US$850,000 plus initial US$1 million</w:t>
             </w:r>
           </w:p>
         </w:tc>
         <w:tc>
           <w:tcPr>
-            <w:tcW w:type="dxa" w:w="2448"/>
+            <w:tcW w:type="dxa" w:w="2664"/>
             <w:vAlign w:val="center"/>
             <w:tcMar>
               <w:top w:w="30" w:type="dxa"/>
@@ -2715,35 +2614,7 @@
                 <w:color w:val="222A27"/>
                 <w:sz w:val="13"/>
               </w:rPr>
-              <w:t>Programme grants in the target band, already in Ghana. A grant to a university is UNVERIFIED.</w:t>
-            </w:r>
-          </w:p>
-        </w:tc>
-        <w:tc>
-          <w:tcPr>
-            <w:tcW w:type="dxa" w:w="1872"/>
-            <w:vAlign w:val="center"/>
-            <w:tcMar>
-              <w:top w:w="30" w:type="dxa"/>
-              <w:left w:w="70" w:type="dxa"/>
-              <w:bottom w:w="30" w:type="dxa"/>
-              <w:right w:w="70" w:type="dxa"/>
-            </w:tcMar>
-          </w:tcPr>
-          <w:p>
-            <w:pPr>
-              <w:spacing w:before="0" w:after="0" w:line="170" w:lineRule="exact"/>
-            </w:pPr>
-            <w:r/>
-            <w:r>
-              <w:rPr>
-                <w:rFonts w:ascii="Arial" w:hAnsi="Arial" w:cs="Arial" w:eastAsia="Arial"/>
-                <w:b w:val="0"/>
-                <w:i w:val="0"/>
-                <w:color w:val="222A27"/>
-                <w:sz w:val="13"/>
-              </w:rPr>
-              <w:t>https://www.afdb.org/en/news-and-events/press-releases/african-development-bank-and-invest-africa-sign-850000-grant-agreement-boost-inclusive-green-jobs-ghana-and-senegal-85980</w:t>
+              <w:t>Green jobs. Already with Invest in Africa.</w:t>
             </w:r>
           </w:p>
         </w:tc>
@@ -2754,7 +2625,7 @@
         </w:trPr>
         <w:tc>
           <w:tcPr>
-            <w:tcW w:type="dxa" w:w="1655"/>
+            <w:tcW w:type="dxa" w:w="3096"/>
             <w:vAlign w:val="center"/>
             <w:tcMar>
               <w:top w:w="30" w:type="dxa"/>
@@ -2776,7 +2647,7 @@
                 <w:color w:val="222A27"/>
                 <w:sz w:val="13"/>
               </w:rPr>
-              <w:t>4. Danida</w:t>
+              <w:t>Mastercard Climate Impact Challenge (4)</w:t>
             </w:r>
           </w:p>
         </w:tc>
@@ -2804,13 +2675,13 @@
                 <w:color w:val="222A27"/>
                 <w:sz w:val="13"/>
               </w:rPr>
-              <w:t>Danida Green Business Partnerships, 2025 round. Climate adaptation. Ghana is eligible.</w:t>
+              <w:t>3-year grants. Round 2 to Jan 2026.</w:t>
             </w:r>
           </w:p>
         </w:tc>
         <w:tc>
           <w:tcPr>
-            <w:tcW w:type="dxa" w:w="2448"/>
+            <w:tcW w:type="dxa" w:w="2664"/>
             <w:vAlign w:val="center"/>
             <w:tcMar>
               <w:top w:w="30" w:type="dxa"/>
@@ -2832,13 +2703,13 @@
                 <w:color w:val="222A27"/>
                 <w:sz w:val="13"/>
               </w:rPr>
-              <w:t>DKK 4 million to 15 million, for 3 to 5 years. Published in kroner, not US dollars. A US dollar conversion is UNVERIFIED.</w:t>
+              <w:t>US$250,000 to US$1,500,000</w:t>
             </w:r>
           </w:p>
         </w:tc>
         <w:tc>
           <w:tcPr>
-            <w:tcW w:type="dxa" w:w="2448"/>
+            <w:tcW w:type="dxa" w:w="2664"/>
             <w:vAlign w:val="center"/>
             <w:tcMar>
               <w:top w:w="30" w:type="dxa"/>
@@ -2860,35 +2731,7 @@
                 <w:color w:val="222A27"/>
                 <w:sz w:val="13"/>
               </w:rPr>
-              <w:t>Size and theme fit. The 2025 rules say a university cannot be the administrative partner, and an international commercial partner is required.</w:t>
-            </w:r>
-          </w:p>
-        </w:tc>
-        <w:tc>
-          <w:tcPr>
-            <w:tcW w:type="dxa" w:w="1872"/>
-            <w:vAlign w:val="center"/>
-            <w:tcMar>
-              <w:top w:w="30" w:type="dxa"/>
-              <w:left w:w="70" w:type="dxa"/>
-              <w:bottom w:w="30" w:type="dxa"/>
-              <w:right w:w="70" w:type="dxa"/>
-            </w:tcMar>
-          </w:tcPr>
-          <w:p>
-            <w:pPr>
-              <w:spacing w:before="0" w:after="0" w:line="170" w:lineRule="exact"/>
-            </w:pPr>
-            <w:r/>
-            <w:r>
-              <w:rPr>
-                <w:rFonts w:ascii="Arial" w:hAnsi="Arial" w:cs="Arial" w:eastAsia="Arial"/>
-                <w:b w:val="0"/>
-                <w:i w:val="0"/>
-                <w:color w:val="222A27"/>
-                <w:sz w:val="13"/>
-              </w:rPr>
-              <w:t>https://danida-business-partnerships.dk/wp-content/uploads/2025/01/DGBP-2025-Guidelines-read-these-if-you-want-to-apply.pdf</w:t>
+              <w:t>For cohort startups, not the hub host.</w:t>
             </w:r>
           </w:p>
         </w:tc>
@@ -2899,7 +2742,7 @@
         </w:trPr>
         <w:tc>
           <w:tcPr>
-            <w:tcW w:type="dxa" w:w="1655"/>
+            <w:tcW w:type="dxa" w:w="3096"/>
             <w:vAlign w:val="center"/>
             <w:tcMar>
               <w:top w:w="30" w:type="dxa"/>
@@ -2921,7 +2764,7 @@
                 <w:color w:val="222A27"/>
                 <w:sz w:val="13"/>
               </w:rPr>
-              <w:t>5. Mastercard Foundation</w:t>
+              <w:t>EU Global Gateway, green growth for jobs (5)</w:t>
             </w:r>
           </w:p>
         </w:tc>
@@ -2949,13 +2792,13 @@
                 <w:color w:val="222A27"/>
                 <w:sz w:val="13"/>
               </w:rPr>
-              <w:t>Climate Impact Challenge Fund, inside the Fund for Resilience and Prosperity. Ghana is a focus country.</w:t>
+              <w:t>MIP to 2027. 2025-27 amount not set.</w:t>
             </w:r>
           </w:p>
         </w:tc>
         <w:tc>
           <w:tcPr>
-            <w:tcW w:type="dxa" w:w="2448"/>
+            <w:tcW w:type="dxa" w:w="2664"/>
             <w:vAlign w:val="center"/>
             <w:tcMar>
               <w:top w:w="30" w:type="dxa"/>
@@ -2977,13 +2820,13 @@
                 <w:color w:val="222A27"/>
                 <w:sz w:val="13"/>
               </w:rPr>
-              <w:t>US$250,000 to US$1,500,000 over three years.</w:t>
+              <w:t>EUR 71.05 million was 2021-24. Later years UNVERIFIED.</w:t>
             </w:r>
           </w:p>
         </w:tc>
         <w:tc>
           <w:tcPr>
-            <w:tcW w:type="dxa" w:w="2448"/>
+            <w:tcW w:type="dxa" w:w="2664"/>
             <w:vAlign w:val="center"/>
             <w:tcMar>
               <w:top w:w="30" w:type="dxa"/>
@@ -3005,13 +2848,46 @@
                 <w:color w:val="222A27"/>
                 <w:sz w:val="13"/>
               </w:rPr>
-              <w:t>Ticket covers the band. Rules require a for-profit SME with at least 3 years of operations, so this fits cohort firms, not the university host. A hub grant is UNVERIFIED.</w:t>
+              <w:t>Strategic window. No named hub call.</w:t>
+            </w:r>
+          </w:p>
+        </w:tc>
+      </w:tr>
+      <w:tr>
+        <w:trPr>
+          <w:cantSplit/>
+        </w:trPr>
+        <w:tc>
+          <w:tcPr>
+            <w:tcW w:type="dxa" w:w="3096"/>
+            <w:vAlign w:val="center"/>
+            <w:tcMar>
+              <w:top w:w="30" w:type="dxa"/>
+              <w:left w:w="70" w:type="dxa"/>
+              <w:bottom w:w="30" w:type="dxa"/>
+              <w:right w:w="70" w:type="dxa"/>
+            </w:tcMar>
+          </w:tcPr>
+          <w:p>
+            <w:pPr>
+              <w:spacing w:before="0" w:after="0" w:line="170" w:lineRule="exact"/>
+            </w:pPr>
+            <w:r/>
+            <w:r>
+              <w:rPr>
+                <w:rFonts w:ascii="Arial" w:hAnsi="Arial" w:cs="Arial" w:eastAsia="Arial"/>
+                <w:b/>
+                <w:i w:val="0"/>
+                <w:color w:val="222A27"/>
+                <w:sz w:val="13"/>
+              </w:rPr>
+              <w:t>UK-Ghana Growth Partnership (6)</w:t>
             </w:r>
           </w:p>
         </w:tc>
         <w:tc>
           <w:tcPr>
-            <w:tcW w:type="dxa" w:w="1872"/>
+            <w:tcW w:type="dxa" w:w="2232"/>
             <w:vAlign w:val="center"/>
             <w:tcMar>
               <w:top w:w="30" w:type="dxa"/>
@@ -3033,7 +2909,63 @@
                 <w:color w:val="222A27"/>
                 <w:sz w:val="13"/>
               </w:rPr>
-              <w:t>https://frp.org/sites/default/files/2024-11/Climate%20Impact%20Challenge%20Fund_summary.pdf</w:t>
+              <w:t>2026 to 2028</w:t>
+            </w:r>
+          </w:p>
+        </w:tc>
+        <w:tc>
+          <w:tcPr>
+            <w:tcW w:type="dxa" w:w="2664"/>
+            <w:vAlign w:val="center"/>
+            <w:tcMar>
+              <w:top w:w="30" w:type="dxa"/>
+              <w:left w:w="70" w:type="dxa"/>
+              <w:bottom w:w="30" w:type="dxa"/>
+              <w:right w:w="70" w:type="dxa"/>
+            </w:tcMar>
+          </w:tcPr>
+          <w:p>
+            <w:pPr>
+              <w:spacing w:before="0" w:after="0" w:line="170" w:lineRule="exact"/>
+            </w:pPr>
+            <w:r/>
+            <w:r>
+              <w:rPr>
+                <w:rFonts w:ascii="Arial" w:hAnsi="Arial" w:cs="Arial" w:eastAsia="Arial"/>
+                <w:b w:val="0"/>
+                <w:i w:val="0"/>
+                <w:color w:val="222A27"/>
+                <w:sz w:val="13"/>
+              </w:rPr>
+              <w:t>GBP 5 million green prep. GBP 6 million AI and science.</w:t>
+            </w:r>
+          </w:p>
+        </w:tc>
+        <w:tc>
+          <w:tcPr>
+            <w:tcW w:type="dxa" w:w="2664"/>
+            <w:vAlign w:val="center"/>
+            <w:tcMar>
+              <w:top w:w="30" w:type="dxa"/>
+              <w:left w:w="70" w:type="dxa"/>
+              <w:bottom w:w="30" w:type="dxa"/>
+              <w:right w:w="70" w:type="dxa"/>
+            </w:tcMar>
+          </w:tcPr>
+          <w:p>
+            <w:pPr>
+              <w:spacing w:before="0" w:after="0" w:line="170" w:lineRule="exact"/>
+            </w:pPr>
+            <w:r/>
+            <w:r>
+              <w:rPr>
+                <w:rFonts w:ascii="Arial" w:hAnsi="Arial" w:cs="Arial" w:eastAsia="Arial"/>
+                <w:b w:val="0"/>
+                <w:i w:val="0"/>
+                <w:color w:val="222A27"/>
+                <w:sz w:val="13"/>
+              </w:rPr>
+              <w:t>Live partnership. Not a hub grant.</w:t>
             </w:r>
           </w:p>
         </w:tc>
@@ -3041,7 +2973,7 @@
     </w:tbl>
     <w:p>
       <w:pPr>
-        <w:spacing w:before="40" w:after="0" w:line="200" w:lineRule="exact"/>
+        <w:spacing w:before="40" w:after="20" w:line="190" w:lineRule="exact"/>
       </w:pPr>
       <w:r>
         <w:rPr>
@@ -3049,9 +2981,24 @@
           <w:b w:val="0"/>
           <w:i w:val="0"/>
           <w:color w:val="222A27"/>
-          <w:sz w:val="16"/>
+          <w:sz w:val="15"/>
         </w:rPr>
-        <w:t>Not ranked. USAID: a March 2025 Appropriations letter states that 86% of USAID awards were terminated (https://storage.courtlistener.com/recap/gov.uscourts.dcd.277562/gov.uscourts.dcd.277562.39.18.pdf). Do not plan a new USAID hub grant on the old pipeline. Below this band: FCDO TRANSFORM at GBP 100,000 per enterprise; EU Joint Innovation Facility at EUR 100,000 to 250,000; Orange Corners Ghana at up to EUR 50,000 per entrepreneur. UNDP Ghana Climate Promise is a US$864,000 project with low-value grants. Rockefeller funded the African School of Regulation in Accra at US$1 million (2023) and US$3 million (2024): energy regulation, not a startup hub. SECO GPSCP II is CHF 9 million for cashew and oil palm.</w:t>
+        <w:t>Ranks 7 to 10 are in the full scan. (1) danida-business-partnerships.dk  (2) ghanacic.ashesi.edu.gh  (3) afdb.org MicroGREEN release  (4) frp.org Climate Impact Challenge Fund  (5) EU MIP annex, international-partnerships.ec.europa.eu  (6) gov.uk UK-Ghana Growth Partnership.</w:t>
+      </w:r>
+    </w:p>
+    <w:p>
+      <w:pPr>
+        <w:spacing w:before="20" w:after="0" w:line="220" w:lineRule="exact"/>
+      </w:pPr>
+      <w:r>
+        <w:rPr>
+          <w:rFonts w:ascii="Georgia" w:hAnsi="Georgia" w:cs="Georgia" w:eastAsia="Georgia"/>
+          <w:b w:val="0"/>
+          <w:i w:val="0"/>
+          <w:color w:val="222A27"/>
+          <w:sz w:val="17"/>
+        </w:rPr>
+        <w:t>Best routes: Danida with PVBLIC as lead, GIZ renewal, Mastercard for cohort startups. USAID out (86% of awards terminated, Mar 2025).</w:t>
       </w:r>
     </w:p>
     <w:sectPr>

</xml_diff>